<commit_message>
resulto bugs en minuta - compraventa
</commit_message>
<xml_diff>
--- a/backend/app/templates/minuta_compraventa.docx
+++ b/backend/app/templates/minuta_compraventa.docx
@@ -57,7 +57,7 @@
       </w:pPr>
       <w:r>
         <w:rPr/>
-        <w:t>PRIMERA.- COMPARECIENTES.- Comparecen a la celebración del presente contrato por una parte: {% for grupo in grupos_vendedores %}{% if grupo.es_empresa %}{% for p in grupo.personas %}{{ p.numero_numerico }}.- La compañía {{ p.razon_social }}, con RUC número {{ p.ruc_palabras }} ({{ p.ruc }}), debidamente representada por su {{ p.rep_cargo }}, {{ p.rep_articulo }} {{ p.rep_nombres_completos }}, de nacionalidad {{ p.rep_nacionalidad }}, con {{ p.rep_cedula_palabras }} ({{ p.rep_cedula }}), de {{ p.rep_edad }} años de edad, {{ p.rep_prof_ocup }}, con domicilio físico en {{ p.rep_direccion }}{% endfor %}{% else %}{% if grupo.tipo == 'conyuges' %}los cónyuges señores: {% endif %}{% for p in grupo.personas %}{{ p.numero_numerico }}.- {{ p.nombres_completos }}, de nacionalidad {{ p.nacionalidad }}, con cédula de ciudadanía número {{ p.cedula_palabras }} ({{ p.cedula }}), de {{ p.edad }} años de edad, de estado civil {{ p.estado_civil }}, de profesión {{ p.profesion }} y de ocupación {{ p.ocupacion }}, teléfono celular número {{ p.telefono_palabras }} ({{ p.telefono }}), con domicilio electrónico en el correo {{ p.email }}, por sus propios y personales derechos{% if not loop.last %}; y, {% endif %}{% endfor %}{% if grupo.tipo == 'conyuges' %}; ambos{% endif %} domiciliado{% if grupo.tipo == 'conyuges' %}s{% endif %} físicamente en {{ grupo.direccion }}{% endif %}{% if not loop.last %}; {% if grupos_vendedores[loop.index].tipo == 'soltero' %}y, el señor: {% elif grupos_vendedores[loop.index].es_empresa %}y, {% endif %}{% endif %}{% endfor %}, a quien se denominará LA PARTE VENDEDORA; y, por otra: {% for grupo in grupos_compradores %}{% if grupo.es_empresa %}{% for p in grupo.personas %}{{ p.numero_numerico }}.- La compañía {{ p.razon_social }}, con RUC número {{ p.ruc_palabras }} ({{ p.ruc }}), debidamente representada por su {{ p.rep_cargo }}, {{ p.rep_articulo }} {{ p.rep_nombres_completos }}, de nacionalidad {{ p.rep_nacionalidad }}, con {{ p.rep_cedula_palabras }} ({{ p.rep_cedula }}), de {{ p.rep_edad }} años de edad, {{ p.rep_prof_ocup }}, con domicilio físico en {{ p.rep_direccion }}{% endfor %}{% else %}{% if grupo.tipo == 'conyuges' %}los cónyuges señores: {% endif %}{% for p in grupo.personas %}{{ p.numero_numerico }}.- {{ p.nombres_completos }}, de nacionalidad {{ p.nacionalidad }}, con cédula de ciudadanía número {{ p.cedula_palabras }} ({{ p.cedula }}), de {{ p.edad }} años de edad, de estado civil {{ p.estado_civil }}, de profesión {{ p.profesion }} y de ocupación {{ p.ocupacion }}, teléfono celular número {{ p.telefono_palabras }} ({{ p.telefono }}), con domicilio electrónico en el correo {{ p.email }}, por sus propios y personales derechos{% if not loop.last %}; y, {% endif %}{% endfor %}{% if grupo.tipo == 'conyuges' %}; ambos{% endif %} domiciliado{% if grupo.tipo == 'conyuges' %}s{% endif %} físicamente en {{ grupo.direccion }}{% endif %}{% if not loop.last %}; {% if grupos_compradores[loop.index].tipo == 'soltero' %}y, el señor: {% elif grupos_compradores[loop.index].es_empresa %}y, {% endif %}{% endif %}{% endfor %}, a quien se denominará LA PARTE COMPRADORA.</w:t>
+        <w:t>PRIMERA.- COMPARECIENTES.- Comparecen a la celebración del presente contrato por una parte: {% for grupo in grupos_vendedores %}{% if grupo.es_empresa %}{% for p in grupo.personas %}{{ p.numero_numerico }}.- La compañía {{ p.razon_social }}, con RUC número {{ p.ruc_palabras }} ({{ p.ruc }}), debidamente representada por su {{ p.rep_cargo }}, {{ p.rep_articulo }} {{ p.rep_nombres_completos }}, de nacionalidad {{ p.rep_nacionalidad }}, con {{ p.rep_cedula_palabras }} ({{ p.rep_cedula }}), de {{ p.rep_edad }} años de edad, {{ p.rep_prof_ocup }}, con domicilio físico en {{ p.rep_direccion }}{% endfor %}{% else %}{% if grupo.tipo == 'conyuges' %}los cónyuges señores: {% endif %}{% for p in grupo.personas %}{{ p.numero_numerico }}.- {{ p.nombres_completos }}, de nacionalidad {{ p.nacionalidad }}, con cédula de ciudadanía número {{ p.cedula_palabras }} ({{ p.cedula }}), de {{ p.edad }} años de edad, de estado civil {{ p.estado_civil }}, de profesión {{ p.profesion }} y de ocupación {{ p.ocupacion }}, teléfono celular número {{ p.telefono_palabras }} ({{ p.telefono }}), con domicilio electrónico en el correo {{ p.email }}, por sus propios y personales derechos{% if not loop.last %}; y, {% endif %}{% endfor %}{% if grupo.tipo == 'conyuges' %}; ambos{% endif %} domiciliado{% if grupo.tipo == 'conyuges' %}s{% endif %} físicamente en {{ grupo.direccion }}{% endif %}{% if not loop.last %}; {% if grupos_vendedores[loop.index0].tipo == 'soltero' %}y, el señor: {% elif grupos_vendedores[loop.index0].es_empresa %}y, {% endif %}{% endif %}{% endfor %}, a quien se denominará LA PARTE VENDEDORA; y, por otra: {% for grupo in grupos_compradores %}{% if grupo.es_empresa %}{% for p in grupo.personas %}{{ p.numero_numerico }}.- La compañía {{ p.razon_social }}, con RUC número {{ p.ruc_palabras }} ({{ p.ruc }}), debidamente representada por su {{ p.rep_cargo }}, {{ p.rep_articulo }} {{ p.rep_nombres_completos }}, de nacionalidad {{ p.rep_nacionalidad }}, con {{ p.rep_cedula_palabras }} ({{ p.rep_cedula }}), de {{ p.rep_edad }} años de edad, {{ p.rep_prof_ocup }}, con domicilio físico en {{ p.rep_direccion }}{% endfor %}{% else %}{% if grupo.tipo == 'conyuges' %}los cónyuges señores: {% endif %}{% for p in grupo.personas %}{{ p.numero_numerico }}.- {{ p.nombres_completos }}, de nacionalidad {{ p.nacionalidad }}, con cédula de ciudadanía número {{ p.cedula_palabras }} ({{ p.cedula }}), de {{ p.edad }} años de edad, de estado civil {{ p.estado_civil }}, de profesión {{ p.profesion }} y de ocupación {{ p.ocupacion }}, teléfono celular número {{ p.telefono_palabras }} ({{ p.telefono }}), con domicilio electrónico en el correo {{ p.email }}, por sus propios y personales derechos{% if not loop.last %}; y, {% endif %}{% endfor %}{% if grupo.tipo == 'conyuges' %}; ambos{% endif %} domiciliado{% if grupo.tipo == 'conyuges' %}s{% endif %} físicamente en {{ grupo.direccion }}{% endif %}{% if not loop.last %}; {% if grupos_compradores[loop.index0].tipo == 'soltero' %}y, el señor: {% elif grupos_compradores[loop.index0].es_empresa %}y, {% endif %}{% endif %}{% endfor %}, a quien se denominará LA PARTE COMPRADORA.</w:t>
       </w:r>
     </w:p>
     <w:p>
@@ -103,7 +103,7 @@
       </w:pPr>
       <w:r>
         <w:rPr/>
-        <w:t>UNO.- LA PARTE VENDEDORA es propietaria de los siguientes inmuebles: {% for predio in predios %}{% if predio.es_compuesto %}{% for inmueble in predio.inmuebles %}{% if inmueble.tipo == 'Otro' %}{{ inmueble.tipo_otro }}{% else %}{{ inmueble.tipo }}{% endif %} {% if predio.tipo == 'Otro' %}{{ predio.tipo_otro }}{% else %}{{ predio.tipo }}{% endif %} {{ predio.numero }}, nivel {{ inmueble.nivel }}, {% if inmueble.area_cubierta %}área cubierta {{ inmueble.area_cubierta_palabras }} metros cuadrados, {% endif %}{% if inmueble.area_descubierta %}área descubierta {{ inmueble.area_descubierta_palabras }} metros cuadrados, {% endif %}Alícuota parcial {{ inmueble.alicuota_parcial_palabras }} por ciento; {% endfor %}Alícuota total {{ predio.alicuota_total_palabras }} por ciento; {% else %}{% if predio.tipo == 'Otro' %}{{ predio.tipo_otro }}{% else %}{{ predio.tipo }}{% endif %} {{ predio.numero_palabras }}, nivel {{ predio.inmuebles[0].nivel }}, {% if predio.inmuebles[0].area_cubierta %}área cubierta {{ predio.inmuebles[0].area_cubierta_palabras }} metros cuadrados, {% endif %}{% if predio.inmuebles[0].area_descubierta %}área descubierta {{ predio.inmuebles[0].area_descubierta_palabras }} metros cuadrados, {% endif %}Alícuota parcial {{ predio.inmuebles[0].alicuota_parcial_palabras }} por ciento, Alícuota total {{ predio.alicuota_total_palabras }} por ciento; {% endif %}{% endfor %}{% if es_horizontal %}del {{ nombre_conjunto }}, construido en el {{ ubicacion.lote }} número {{ ubicacion.numero }}, situado en la parroquia {{ ubicacion.parroquia }}, cantón {{ ubicacion.canton }}, Provincia de {{ ubicacion.provincia }}.{% endif %}</w:t>
+        <w:t>UNO.- LA PARTE VENDEDORA es propietaria de los siguientes inmuebles: {% for predio in predios %}{% if predio.es_compuesto %}{% for inmueble in predio.inmuebles %}{% if inmueble.tipo == 'Otro' %}{{ inmueble.tipo_otro }}{% else %}{{ inmueble.tipo }}{% endif %} {% if predio.tipo == 'Otro' %}{{ predio.tipo_otro }}{% else %}{{ predio.tipo }}{% endif %} {{ predio.numero }}, nivel {{ inmueble.nivel }}, {% if inmueble.area_cubierta %}área cubierta {{ inmueble.area_cubierta_palabras }} metros cuadrados, {% endif %}{% if inmueble.area_descubierta %}área descubierta {{ inmueble.area_descubierta_palabras }} metros cuadrados, {% endif %}Alícuota parcial {{ inmueble.alicuota_parcial_palabras }} por ciento; {% endfor %}Alícuota total {{ predio.alicuota_total_palabras }} por ciento; {% else %}{% if predio.tipo == 'Otro' %}{{ predio.tipo_otro }}{% else %}{{ predio.tipo }}{% endif %} {{ predio.numero_palabras }}, nivel {{ predio.inmuebles[0].nivel }}, {% if predio.inmuebles[0].area_cubierta %}área cubierta {{ predio.inmuebles[0].area_cubierta_palabras }} metros cuadrados, {% endif %}{% if predio.inmuebles[0].area_descubierta %}área descubierta {{ predio.inmuebles[0].area_descubierta_palabras }} metros cuadrados, {% endif %}Alícuota parcial {{ predio.inmuebles[0].alicuota_parcial_palabras }} por ciento, Alícuota total {{ predio.alicuota_total_palabras }} por ciento; {% endif %}{% endfor %}{% if es_horizontal %}del {{ nombre_conjunto }}, construido en el {{ ubicacion.lote }} número {{ ubicacion.numero_palabras }}, situado en la parroquia {{ ubicacion.parroquia }}, cantón {{ ubicacion.canton }}, Provincia de {{ ubicacion.provincia }}.{% endif %}</w:t>
       </w:r>
     </w:p>
     <w:p>
@@ -162,7 +162,7 @@
       </w:pPr>
       <w:r>
         <w:rPr/>
-        <w:t>DOS.- Las referidas alícuotas fueron adquiridas por LA PARTE VENDEDORA a título de {{ historia.titulo }}{% if historia.titulo == 'otro' %} {{ historia.titulo_otro }}{% endif %}, {% if historia.titulo != 'sucesion' %}a {{ historia.adquirido_de }}, {% else %}por sucesión a causa de muerte del causante {{ historia.nombre_causante }}, mediante {{ historia.tipo_sucesion }}, {% endif %}según consta de la escritura pública celebrada el {{ historia.fecha_otorgamiento }}, ante el notario {{ historia.numero_notaria }} del cantón {{ historia.canton_notaria }}, {{ historia.notario }}, inscrita en el Registro de la Propiedad el {{ historia.fecha_inscripcion }}{% if historia.mismo_canton %}, del mismo cantón{% elif historia.canton_inscripcion %}, del cantón {{ historia.canton_inscripcion }}{% endif %}.{% if historia.es_sucesion %} Por su parte, el causante adquirió la propiedad por {{ historia.causante_titulo }}{% if historia.causante_titulo == 'otro' %} {{ historia.causante_titulo_otro }}{% endif %} a {{ historia.causante_adquirido_de }}, según consta de la escritura pública otorgada el {{ historia.causante_fecha_otorgamiento }}, ante el Notario {{ historia.causante_numero_notaria }} del cantón {{ historia.causante_canton_notaria }}, {{ historia.causante_notario }}, e inscrita en el Registro de la Propiedad el {{ historia.causante_fecha_inscripcion }}{% if historia.causante_mismo_canton %}, del mismo cantón{% elif historia.causante_canton_inscripcion %}, del cantón {{ historia.causante_canton_inscripcion }}{% endif %}.{% endif %}</w:t>
+        <w:t>DOS.- Las referidas alícuotas fueron adquiridas por LA PARTE VENDEDORA a título de {{ historia.titulo }}{% if historia.titulo == 'otro' %} {{ historia.titulo_otro }}{% endif %}, {% if historia.titulo != 'sucesion' %}a {{ historia.adquirido_de }}, {% else %}por sucesión a causa de muerte del causante {{ historia.nombre_causante }}, mediante {{ historia.tipo_sucesion }}, {% endif %}según consta de la escritura pública celebrada el {{ historia.fecha_otorgamiento }}, ante la Notaría {{ historia.numero_notaria_palabras }} del cantón {{ historia.canton_notaria }}, {{ historia.notario }}, inscrita en el Registro de la Propiedad el {{ historia.fecha_inscripcion }}{% if historia.mismo_canton %}, del mismo cantón{% elif historia.canton_inscripcion %}, del cantón {{ historia.canton_inscripcion }}{% endif %}.{% if historia.es_sucesion %} Por su parte, el causante adquirió la propiedad por {{ historia.causante_titulo }}{% if historia.causante_titulo == 'otro' %} {{ historia.causante_titulo_otro }}{% endif %} a {{ historia.causante_adquirido_de }}, según consta de la escritura pública otorgada el {{ historia.causante_fecha_otorgamiento }}, ante la Notaría {{ historia.causante_numero_notaria_palabras }} del cantón {{ historia.causante_canton_notaria }}, {{ historia.causante_notario }}, e inscrita en el Registro de la Propiedad el {{ historia.causante_fecha_inscripcion }}{% if historia.causante_mismo_canton %}, del mismo cantón{% elif historia.causante_canton_inscripcion %}, del cantón {{ historia.causante_canton_inscripcion }}{% endif %}.{% endif %}</w:t>
       </w:r>
     </w:p>
     <w:p>
@@ -245,7 +245,7 @@
       </w:pPr>
       <w:r>
         <w:rPr/>
-        <w:t xml:space="preserve">TRES.- La declaratoria de propiedad horizontal del {{ nombre_conjunto }}, consta en la escritura pública celebrada el {{ declaratoria.fecha_otorgamiento }}, ante {% if declaratoria.notario %}{{ declaratoria.notario }}, Notari{% else %}el Notari{% endif %}{{ declaratoria.numero_notaria }} del cantón {{ declaratoria.canton_notaria }}, inscrita en el Registro de la Propiedad el {{ declaratoria.fecha_inscripcion }}{% if declaratoria.mismo_canton %}, del mismo cantón{% elif declaratoria.canton_inscripcion %}, del cantón {{ declaratoria.canton_inscripcion }}{% endif %}. </w:t>
+        <w:t xml:space="preserve">TRES.- La declaratoria de propiedad horizontal del {{ nombre_conjunto }}, consta en la escritura pública celebrada el {{ declaratoria.fecha_otorgamiento }}, ante {% if declaratoria.notario %}{{ declaratoria.notario }}, Notaría {% else %}Notaría {% endif %}{{ declaratoria.numero_notaria_palabras }} del cantón {{ declaratoria.canton_notaria }}, inscrita en el Registro de la Propiedad el {{ declaratoria.fecha_inscripcion }}{% if declaratoria.mismo_canton %}, del mismo cantón{% elif declaratoria.canton_inscripcion %}, del cantón {{ declaratoria.canton_inscripcion }}{% endif %}. </w:t>
       </w:r>
     </w:p>
     <w:p>
@@ -292,7 +292,7 @@
       </w:pPr>
       <w:r>
         <w:rPr/>
-        <w:t xml:space="preserve">{% if es_horizontal %}CUATRO{% else %}TRES{% endif %}.- {% if es_horizontal %}El {{ nombre_conjunto }}, se encuentra construido sobre el {{ ubicacion.lote }} número {{ ubicacion.numero }}, ubicado{% else %}El inmueble se encuentra ubicado{% endif %} dentro de los siguientes linderos y dimensiones generales: POR EL NORTE.- En {{ linderos.norte_metros_palabras }} metros, con {{ linderos.norte_colindancia }}; POR EL SUR.- En {{ linderos.sur_metros_palabras }} metros, con {{ linderos.sur_colindancia }}; POR EL ESTE.- En {{ linderos.este_metros_palabras }} metros, con {{ linderos.este_colindancia }}; y, POR EL OESTE.- En {{ linderos.oeste_metros_palabras }} metros, con {{ linderos.oeste_colindancia }}. SUPERFICIE.- {{ linderos.superficie_palabras }} metros cuadrados. Los demás antecedentes de dominio constan detallados en el certificado de gravámenes del inmueble que se habilita. </w:t>
+        <w:t xml:space="preserve">{% if es_horizontal %}CUATRO{% else %}TRES{% endif %}.- {% if es_horizontal %}El {{ nombre_conjunto }}, se encuentra construido sobre el {{ ubicacion.lote }} número {{ ubicacion.numero_palabras }}, ubicado{% else %}El inmueble se encuentra ubicado{% endif %} dentro de los siguientes linderos y dimensiones generales: POR EL NORTE.- En {{ linderos.norte_metros_palabras }} metros, con {{ linderos.norte_colindancia }}; POR EL SUR.- En {{ linderos.sur_metros_palabras }} metros, con {{ linderos.sur_colindancia }}; POR EL ESTE.- En {{ linderos.este_metros_palabras }} metros, con {{ linderos.este_colindancia }}; y, POR EL OESTE.- En {{ linderos.oeste_metros_palabras }} metros, con {{ linderos.oeste_colindancia }}. SUPERFICIE.- {{ linderos.superficie_palabras }} metros cuadrados. Los demás antecedentes de dominio constan detallados en el certificado de gravámenes del inmueble que se habilita. </w:t>
       </w:r>
     </w:p>
     <w:p>
@@ -361,30 +361,30 @@
       </w:pPr>
       <w:r>
         <w:rPr/>
-        <w:t xml:space="preserve">TERCERA.- OBJETO DEL CONTRATO.- {% if sujeto_manual %}{{ sujeto_texto|richtext }}{% else %}Con estos antecedentes LA PARTE VENDEDORA, actual e irrevocablemente da en venta real y perpetua enajenación a favor de LA PARTE COMPRADORA, la propiedad de los inmuebles antes descritos{% if predios %}, esto es, {% for predio in predios %}{% if predio.es_compuesto %}{% for inmueble in predio.inmuebles %}{% if inmueble.tipo == 'Otro' %}{{ inmueble.tipo_otro }}{% else %}{{ inmueble.tipo }}{% endif %} {% if predio.tipo == 'Otro' %}{{ predio.tipo_otro }}{% else %}{{ predio.tipo }}{% endif %} {{ predio.numero }}, nivel {{ inmueble.nivel }}, {% if inmueble.area_cubierta %}área cubierta {{ inmueble.area_cubierta_palabras }} metros cuadrados, {% endif %}{% if inmueble.area_descubierta %}área descubierta {{ inmueble.area_descubierta_palabras }} metros cuadrados, {% endif %}Alícuota parcial {{ inmueble.alicuota_parcial_palabras }} por ciento; {% endfor %}Alícuota total {{ predio.alicuota_total_palabras }} por ciento; {% else %}{% if predio.tipo == 'Otro' %}{{ predio.tipo_otro }}{% else %}{{ predio.tipo }}{% endif %} {{ predio.numero_palabras }}, nivel {{ predio.inmuebles[0].nivel }}, {% if predio.inmuebles[0].area_cubierta %}área cubierta {{ predio.inmuebles[0].area_cubierta_palabras }} metros cuadrados, {% endif %}{% if predio.inmuebles[0].area_descubierta %}área descubierta {{ predio.inmuebles[0].area_descubierta_palabras }} metros cuadrados, {% endif %}Alícuota parcial {{ predio.inmuebles[0].alicuota_parcial_palabras }} por ciento, Alícuota total {{ predio.alicuota_total_palabras }} por ciento; {% endif %}{% endfor %}{% endif %}{% if es_horizontal %}, del {{ nombre_conjunto }}, construido en el {{ ubicacion.lote }} número {{ ubicacion.numero }}, situado en la parroquia {{ ubicacion.parroquia }}, cantón {{ ubicacion.canton }}, Provincia de {{ ubicacion.provincia }}{% endif %}. La presente venta y transferencia de dominio se hace con todas las entradas, salidas, usos, costumbres, servidumbres activas y pasivas y todo cuanto por Ley se considere inmueble por destinación, accesión o naturaleza que sean inherentes a {% if es_horizontal %}las alícuotas{% else %}el inmueble{% endif %} cuya propiedad se transfieren.{% endif %} </w:t>
-      </w:r>
-    </w:p>
-    <w:p>
-      <w:pPr>
-        <w:pStyle w:val="Normal"/>
-        <w:bidi w:val="0"/>
-        <w:jc w:val="left"/>
-        <w:rPr/>
-      </w:pPr>
-      <w:r>
-        <w:rPr/>
-      </w:r>
-    </w:p>
-    <w:p>
-      <w:pPr>
-        <w:pStyle w:val="Normal"/>
-        <w:bidi w:val="0"/>
-        <w:jc w:val="left"/>
-        <w:rPr/>
-      </w:pPr>
-      <w:r>
-        <w:rPr/>
-        <w:t>CUARTA.- PRECIO.- {% if precio_manual %}{{ precio_texto|richtext }}{% else %}Las partes han fijado como justo precio por {% if es_horizontal %}las alícuotas{% else %}el inmueble{% endif %} objeto de esta compraventa la suma de: ${{ precio.total }} ({{ precio.total_palabras }} DÓLARES DE LOS ESTADOS UNIDOS DE AMÉRICA), que son cancelados por LA PARTE COMPRADORA a LA PARTE VENDEDORA, de la siguiente forma: {% for parte in precio.partes %}{{ parte.letra }}) {% if parte.es_cuotas %}La suma de {{ parte.monto_palabras }} DÓLARES DE LOS ESTADOS UNIDOS DE AMÉRICA ({{ parte.monto }} USD), pagaderos en {{ parte.numero_cuotas_palabras }} cuotas {{ parte.periodicidad }}s de {{ parte.valor_cuota_palabras }} DÓLARES DE LOS ESTADOS UNIDOS DE AMÉRICA ({{ parte.valor_cuota }} USD) cada una, mediante {{ parte.medio_pago }}{% if parte.es_credito %}, con fondos provenientes del crédito hipotecario otorgado por {{ parte.nombre_banco }}, valores que se acreditarán a {{ parte.cuenta_destino }}{% endif %};{% else %}El valor de {{ parte.monto_palabras }} DÓLARES DE LOS ESTADOS UNIDOS DE AMÉRICA ({{ parte.monto }} USD), {% if parte.momento_pago == 'ya_pagado' %}fueron pagados en forma previa a la suscripción de esta escritura pública, valores que LA PARTE VENDEDORA declara haberlos recibido a plena satisfacción{% elif parte.momento_pago == 'al_firmar' %}se pagan al momento de la firma de esta escritura pública{% elif parte.momento_pago == 'despues_inscribir' %}se pagarán inmediatamente después de que se inscriba el presente título en el Registro de la Propiedad{% else %}{{ parte.momento_otro }}{% endif %}, mediante {{ parte.medio_pago }}{% if parte.medio_pago == 'cheque' %} {{ parte.tipo_cheque }}{% endif %}{% if parte.es_credito %}, con fondos provenientes del crédito hipotecario otorgado por {{ parte.nombre_banco }}, valores que se acreditarán a {{ parte.cuenta_destino }}{% endif %};{% endif %} {% if not loop.last %}y, {% endif %}{% endfor %} LA PARTE COMPRADORA, declara bajo juramento que los valores que entrega en pago del precio fijado por la compraventa que se hace a su favor, tiene un origen lícito y en especial no provienen de ninguna actividad prohibida o sancionada por la Ley.{% endif %}</w:t>
+        <w:t xml:space="preserve">TERCERA.- OBJETO DEL CONTRATO.- {% if sujeto_manual %}{{ sujeto_texto|richtext }}{% else %}Con estos antecedentes LA PARTE VENDEDORA, actual e irrevocablemente da en venta real y perpetua enajenación a favor de LA PARTE COMPRADORA, la propiedad de los inmuebles antes descritos{% if predios %}, esto es, {% for predio in predios %}{% if predio.es_compuesto %}{% for inmueble in predio.inmuebles %}{% if inmueble.tipo == 'Otro' %}{{ inmueble.tipo_otro }}{% else %}{{ inmueble.tipo }}{% endif %} {% if predio.tipo == 'Otro' %}{{ predio.tipo_otro }}{% else %}{{ predio.tipo }}{% endif %} {{ predio.numero }}, nivel {{ inmueble.nivel }}, {% if inmueble.area_cubierta %}área cubierta {{ inmueble.area_cubierta_palabras }} metros cuadrados, {% endif %}{% if inmueble.area_descubierta %}área descubierta {{ inmueble.area_descubierta_palabras }} metros cuadrados, {% endif %}Alícuota parcial {{ inmueble.alicuota_parcial_palabras }} por ciento; {% endfor %}Alícuota total {{ predio.alicuota_total_palabras }} por ciento; {% else %}{% if predio.tipo == 'Otro' %}{{ predio.tipo_otro }}{% else %}{{ predio.tipo }}{% endif %} {{ predio.numero_palabras }}, nivel {{ predio.inmuebles[0].nivel }}, {% if predio.inmuebles[0].area_cubierta %}área cubierta {{ predio.inmuebles[0].area_cubierta_palabras }} metros cuadrados, {% endif %}{% if predio.inmuebles[0].area_descubierta %}área descubierta {{ predio.inmuebles[0].area_descubierta_palabras }} metros cuadrados, {% endif %}Alícuota parcial {{ predio.inmuebles[0].alicuota_parcial_palabras }} por ciento, Alícuota total {{ predio.alicuota_total_palabras }} por ciento; {% endif %}{% endfor %}{% endif %}{% if es_horizontal %}, del {{ nombre_conjunto }}, construido en el {{ ubicacion.lote }} número {{ ubicacion.numero_palabras }}, situado en la parroquia {{ ubicacion.parroquia }}, cantón {{ ubicacion.canton }}, Provincia de {{ ubicacion.provincia }}{% endif %}. La presente venta y transferencia de dominio se hace con todas las entradas, salidas, usos, costumbres, servidumbres activas y pasivas y todo cuanto por Ley se considere inmueble por destinación, accesión o naturaleza que sean inherentes a {% if es_horizontal %}las alícuotas{% else %}el inmueble{% endif %} cuya propiedad se transfieren.{% endif %} </w:t>
+      </w:r>
+    </w:p>
+    <w:p>
+      <w:pPr>
+        <w:pStyle w:val="Normal"/>
+        <w:bidi w:val="0"/>
+        <w:jc w:val="left"/>
+        <w:rPr/>
+      </w:pPr>
+      <w:r>
+        <w:rPr/>
+      </w:r>
+    </w:p>
+    <w:p>
+      <w:pPr>
+        <w:pStyle w:val="Normal"/>
+        <w:bidi w:val="0"/>
+        <w:jc w:val="left"/>
+        <w:rPr/>
+      </w:pPr>
+      <w:r>
+        <w:rPr/>
+        <w:t>CUARTA.- PRECIO.- {% if precio_manual %}{{ precio_texto|richtext }}{% else %}Las partes han fijado como justo precio por {% if es_horizontal %}las alícuotas{% else %}el inmueble{% endif %} objeto de esta compraventa la suma de: {{ precio.total_palabras }}, que son cancelados por LA PARTE COMPRADORA a LA PARTE VENDEDORA, de la siguiente forma: {% for parte in precio.partes %}{{ parte.letra }}) {% if parte.es_cuotas %}La suma de {{ parte.monto_palabras }}, pagaderos en {{ parte.numero_cuotas_palabras }} cuotas {{ parte.periodicidad }}s de {{ parte.valor_cuota_palabras }} cada una, mediante {{ parte.medio_pago }}{% if parte.es_credito %}, con fondos provenientes del crédito hipotecario otorgado por {{ parte.nombre_banco }}, valores que se acreditarán a {{ parte.cuenta_destino }}{% endif %};{% else %}El valor de {{ parte.monto_palabras }}, {% if parte.momento_pago == 'ya_pagado' %}fueron pagados en forma previa a la suscripción de esta escritura pública, valores que LA PARTE VENDEDORA declara haberlos recibido a plena satisfacción{% elif parte.momento_pago == 'al_firmar' %}se pagan al momento de la firma de esta escritura pública{% elif parte.momento_pago == 'despues_inscribir' %}se pagarán inmediatamente después de que se inscriba el presente título en el Registro de la Propiedad{% else %}{{ parte.momento_otro }}{% endif %}, mediante {{ parte.medio_pago }}{% if parte.medio_pago == 'cheque' %} {{ parte.tipo_cheque }}{% endif %}{% if parte.es_credito %}, con fondos provenientes del crédito hipotecario otorgado por {{ parte.nombre_banco }}, valores que se acreditarán a {{ parte.cuenta_destino }}{% endif %};{% endif %} {% if not loop.last %}y, {% endif %}{% endfor %} LA PARTE COMPRADORA, declara bajo juramento que los valores que entrega en pago del precio fijado por la compraventa que se hace a su favor, tiene un origen lícito y en especial no provienen de ninguna actividad prohibida o sancionada por la Ley.{% endif %}</w:t>
       </w:r>
     </w:p>
     <w:p>

</xml_diff>

<commit_message>
fix: cónyuge comparece, UAFE por persona, bug de foco, campo edificio y correcciones en minuta compraventa
</commit_message>
<xml_diff>
--- a/backend/app/templates/minuta_compraventa.docx
+++ b/backend/app/templates/minuta_compraventa.docx
@@ -30,59 +30,72 @@
         <w:jc w:val="both"/>
       </w:pPr>
       <w:r>
-        <w:t xml:space="preserve">PRIMERA.- COMPARECIENTES.- Comparecen a la celebración del presente contrato por una parte {% for grupo in grupos_vendedores %}{% if grupo.tipo == 'conyuges' %}los cónyuges señores: {% elif grupo.es_empresa %}{% else %}{% if grupo.personas[0].genero == 'femenino' %}la señora: {% else %}el señor: {% endif %}{% endif %}{% for p in grupo.personas %}{{ loop.index + loop.index0 }}.- {% if grupo.es_empresa %}La compañía {{ p.razon_social }}, con RUC número {{ p.ruc_palabras }} ({{ p.ruc }}), representada legalmente por su {{ p.rep_cargo }}, {{ p.rep_articulo }} {{ p.rep_nombre_completo }}, portador de la cédula de ciudadanía número {{ p.rep_cedula_palabras }} ({{ p.rep_cedula }}), de nacionalidad {{ p.rep_nacionalidad }}, de estado civil {{ p.rep_estado_civil }}, de {{ p.rep_edad_palabras }} años de edad, {{ p.rep_profesion_ocupacion }}, domiciliado físicamente en {{ p.rep_direccion }}{% if p.rep_email %}, con domicilio electrónico en el correo {{ p.rep_email }}{% endif %}{% else %}{{ p.nombres_completos }}, portador{% if p.genero == 'femenino' %}a{% endif %} de la cédula de ciudadanía número {{ p.cedula_palabras }} ({{ p.cedula }}), de nacionalidad {{ p.nacionalidad }}, de estado civil {{ p.estado_civil }}, de {{ p.edad_palabras }} años de edad{% if p.profesion %}, de profesión {{ p.profesion }}{% endif %}{% if p.ocupacion %}, de ocupación {{ p.ocupacion }}{% endif %}{% if p.telefono %}, teléfono celular número {{ p.telefono_palabras }} ({{ p.telefono }}){% endif %}{% if p.email %}, con domicilio electrónico en el correo {{ p.email }}{% endif %}{% if grupo.tipo != 'conyuges' %}, domiciliado{% if p.genero == 'femenino' %}a{% endif %} físicamente en {{ grupo.direccion }}{% endif %}, por sus propios y personales derechos{% endif %}{% if not loop.last %}; y, {% endif %}{% endfor %}{% if grupo.tipo == 'conyuges' %}, ambos domiciliados físicamente en {{ grupo.direccion }}{% endif %}; a quien en adelante se le denominará como "LA PARTE VENDEDORA"; y, por otra, {% endfor %}{% for grupo in grupos_compradores %}{% if grupo.tipo == 'conyuges' %}los cónyuges señores: {% elif grupo.es_empresa %}{% else %}{% if grupo.personas[0].genero == 'femenino' %}la señora: {% else %}el señor: {% endif %}{% endif %}{% for p in grupo.personas %}{{ loop.index + loop.index0 + num_vendedores }}.- {% if grupo.es_empresa %}La compañía {{ p.razon_social }}, con RUC número {{ p.ruc_palabras }} ({{ p.ruc }}), representada legalmente por su {{ p.rep_cargo }}, {{ p.rep_articulo }} {{ p.rep_nombre_completo }}, portador de la cédula de ciudadanía número {{ p.rep_cedula_palabras }} ({{ p.rep_cedula }}), de nacionalidad {{ p.rep_nacionalidad }}, de estado civil {{ p.rep_estado_civil }}, de {{ p.rep_edad_palabras }} años de edad, {{ p.rep_profesion_ocupacion }}, domiciliado físicamente en {{ p.rep_direccion }}{% if p.rep_email %}, con domicilio electrónico en el correo {{ p.rep_email }}{% endif %}{% else %}{{ p.nombres_completos }}, portador{% if p.genero == 'femenino' %}a{% endif %} de la cédula de ciudadanía número {{ p.cedula_palabras }} ({{ p.cedula }}), de nacionalidad {{ p.nacionalidad }}, de estado civil {{ p.estado_civil }}, de {{ p.edad_palabras }} años de edad{% if p.profesion %}, de profesión {{ p.profesion }}{% endif %}{% if p.ocupacion %}, de ocupación {{ p.ocupacion }}{% endif %}{% if p.telefono %}, teléfono celular número {{ p.telefono_palabras }} ({{ p.telefono }}){% endif %}{% if p.email %}, con domicilio electrónico en el correo {{ p.email }}{% endif %}{% if grupo.tipo != 'conyuges' %}, domiciliado{% if p.genero == 'femenino' %}a{% endif %} físicamente en {{ grupo.direccion }}{% endif %}, por sus propios y personales derechos{% endif %}{% if not loop.last %}; y, {% endif %}{% endfor %}{% if grupo.tipo == 'conyuges' %}, ambos domiciliados físicamente en {{ grupo.direccion }}{% endif %}; a quien en adelante se le denominará como "LA PARTE COMPRADORA"{% endfor %}Los comparecientes son ecuatorianos, mayores de edad, legalmente capaces para contratar y obligarse.</w:t>
-      </w:r>
-    </w:p>
-    <w:p>
-      <w:r>
-        <w:t xml:space="preserve"/>
-      </w:r>
-    </w:p>
-    <w:p>
-      <w:pPr>
-        <w:jc w:val="both"/>
-      </w:pPr>
-      <w:r>
-        <w:t xml:space="preserve">SEGUNDA.- ANTECEDENTES.- {% for predio in predios %}2.1.- LA PARTE VENDEDORA es propietaria de {% if predio.es_compuesto %}{% for inmueble in predio.inmuebles %}{% if inmueble.tipo == 'Otro' %}{{ inmueble.tipo_otro }}{% else %}{{ inmueble.tipo }}{% endif %} {{ inmueble.numero_palabras }}{% if inmueble.nivel %}, nivel {{ inmueble.nivel }}{% endif %}{% if inmueble.area_cubierta %}, área cubierta {{ inmueble.area_cubierta_palabras }} metros cuadrados{% endif %}{% if inmueble.area_descubierta %}, área descubierta {{ inmueble.area_descubierta_palabras }} metros cuadrados{% endif %}, con una alícuota parcial de {{ inmueble.alicuota_parcial_palabras }}; {% endfor %}que juntos conforman una alícuota total de {{ predio.alicuota_total_palabras }}, forma parte del {% else %}{% for inmueble in predio.inmuebles %}{% if inmueble.tipo == 'Otro' %}{{ inmueble.tipo_otro }}{% else %}{{ inmueble.tipo }}{% endif %} {{ inmueble.numero_palabras }}{% if inmueble.nivel %}, nivel {{ inmueble.nivel }}{% endif %}{% if inmueble.area_cubierta %}, área cubierta {{ inmueble.area_cubierta_palabras }} metros cuadrados{% endif %}{% if inmueble.area_descubierta %}, área descubierta {{ inmueble.area_descubierta_palabras }} metros cuadrados{% endif %}, con una alícuota de {{ inmueble.alicuota_parcial_palabras }}{% endfor %}, del {% endif %}{{ nombre_conjunto }}, construido en el {{ ubicacion.lote }} número {{ ubicacion.numero_palabras }}, situado en la parroquia {{ ubicacion.parroquia }}, cantón {{ ubicacion.canton }}, provincia de {{ ubicacion.provincia }}.{% endfor %}</w:t>
-      </w:r>
-    </w:p>
-    <w:p>
-      <w:r>
-        <w:t xml:space="preserve"/>
-      </w:r>
-    </w:p>
-    <w:p>
-      <w:pPr>
-        <w:jc w:val="both"/>
-      </w:pPr>
-      <w:r>
-        <w:t xml:space="preserve">{% if historia_manual %}{{ historia_texto|richtext }}{% else %}2.2.- LA PARTE VENDEDORA, {% if historia.titulo == 'sucesion' %}{{ historia.nombre_causante }}, adquirió por {{ historia.tipo_sucesion }}, {% else %}adquirió mediante {{ historia.titulo_otro if historia.titulo == 'otro' else historia.titulo }}, {% endif %}a {{ historia.adquirido_de }}, según escritura pública otorgada el {{ historia.fecha_otorgamiento }}, ante la Notaría {{ historia.numero_notaria_palabras }} del cantón {{ historia.canton_notaria }}, {{ historia.notario }}, {% if historia.mismo_canton %}e inscrita en el Registro de la Propiedad el {{ historia.fecha_inscripcion }}.{% else %}e inscrita en el Registro de la Propiedad el {{ historia.fecha_inscripcion }}, del cantón {{ historia.canton_inscripcion }}.{% endif %}{% if historia.es_sucesion %} Por su parte, el causante adquirió la propiedad por {{ historia.causante_titulo_otro if historia.causante_titulo == 'otro' else historia.causante_titulo }}, a {{ historia.causante_adquirido_de }}, según escritura pública otorgada el {{ historia.causante_fecha_otorgamiento }}, ante la Notaría {{ historia.causante_numero_notaria_palabras }} del cantón {{ historia.causante_canton_notaria }}, {{ historia.causante_notario }}, {% if historia.causante_mismo_canton %}e inscrita en el Registro de la Propiedad el {{ historia.causante_fecha_inscripcion }}.{% else %}e inscrita en el Registro de la Propiedad el {{ historia.causante_fecha_inscripcion }}, del cantón {{ historia.causante_canton_inscripcion }}.{% endif %}{% endif %}{% endif %}</w:t>
-      </w:r>
-    </w:p>
-    <w:p>
-      <w:r>
-        <w:t xml:space="preserve"/>
-      </w:r>
-    </w:p>
-    <w:p>
-      <w:pPr>
-        <w:jc w:val="both"/>
-      </w:pPr>
-      <w:r>
-        <w:t xml:space="preserve">{% if es_horizontal %}{% if declaratoria_manual %}{{ declaratoria_texto|richtext }}{% else %}2.3.- El inmueble donde se encuentra fincado el bien objeto de esta compraventa fue declarado en Propiedad Horizontal según escritura pública otorgada el {{ declaratoria.fecha_otorgamiento }}, ante {% if declaratoria.notario %}{{ declaratoria.notario }}, {% endif %}la Notaría {{ declaratoria.numero_notaria_palabras }} del cantón {{ declaratoria.canton_notaria }}, debidamente inscrita en el Registro de la Propiedad del mismo cantón el {{ declaratoria.fecha_inscripcion }}.{% endif %}{% endif %}</w:t>
-      </w:r>
-    </w:p>
-    <w:p>
-      <w:r>
-        <w:t xml:space="preserve"/>
-      </w:r>
-    </w:p>
-    <w:p>
-      <w:pPr>
-        <w:jc w:val="both"/>
-      </w:pPr>
-      <w:r>
-        <w:t xml:space="preserve">2.4.- Los linderos generales del inmueble son los siguientes: NORTE: En una extensión de {{ linderos.norte_metros_palabras }} metros con {{ linderos.norte_colindancia }}; SUR: En una extensión de {{ linderos.sur_metros_palabras }} metros con {{ linderos.sur_colindancia }}; ESTE: En una extensión de {{ linderos.este_metros_palabras }} metros con {{ linderos.este_colindancia }}; OESTE: En una extensión de {{ linderos.oeste_metros_palabras }} metros con {{ linderos.oeste_colindancia }}. SUPERFICIE: {{ linderos.superficie_palabras }} metros cuadrados{% if tiene_linderos_especificos %}; mientras que, los linderos específicos constan en la declaratoria de Propiedad Horizontal referida y en la escritura de compraventa que constituye el título de dominio que posee la parte VENDEDORA y cuya parte pertinente se agrega a la presente escritura como habilitante{% endif %}.</w:t>
+        <w:t xml:space="preserve">PRIMERA.- COMPARECIENTES.- Comparecen a la celebración del presente contrato por una parte {% for grupo in grupos_vendedores %}{% if grupo.tipo == 'conyuges' %}los cónyuges señores: {% elif grupo.es_empresa %}{% else %}{% if grupo.personas[0].genero == 'femenino' %}la señora: {% else %}el señor: {% endif %}{% endif %}{% for p in grupo.personas %}{{ loop.index + loop.index0 }}.- {% if grupo.es_empresa %}La compañía {{ p.razon_social }}, con RUC número {{ p.ruc_palabras }} ({{ p.ruc }}), representada legalmente por su {{ p.rep_cargo }}, {{ p.rep_articulo }} {{ p.rep_nombre_completo }}, portador de la cédula de ciudadanía número {{ p.rep_cedula_palabras }} ({{ p.rep_cedula }}), de nacionalidad {{ p.rep_nacionalidad }}, de estado civil {{ p.rep_estado_civil }}, de {{ p.rep_edad_palabras }} años de edad, {{ p.rep_profesion_ocupacion }}, domiciliado físicamente en {{ p.rep_direccion }}{% if p.rep_email %}, con domicilio electrónico en el correo {{ p.rep_email }}{% endif %}{% else %}{{ p.nombres_completos }}, portador{% if p.genero == 'femenino' %}a{% endif %} de la cédula de ciudadanía número {{ p.cedula_palabras }} ({{ p.cedula }}), de nacionalidad {{ p.nacionalidad }}, de estado civil {{ p.estado_civil }}, de {{ p.edad_palabras }} años de edad{% if p.profesion %}, de profesión {{ p.profesion }}{% endif %}{% if p.ocupacion %}, de ocupación {{ p.ocupacion }}{% endif %}{% if p.telefono %}, teléfono celular número {{ p.telefono_palabras }} ({{ p.telefono }}){% endif %}{% if p.email %}, con domicilio electrónico en el correo {{ p.email }}{% endif %}{% if grupo.tipo != 'conyuges' %}, domiciliado{% if p.genero == 'femenino' %}a{% endif %} físicamente en {{ grupo.direccion }}{% endif %}, por sus propios y personales derechos{% endif %}{% if not loop.last %}; y, {% endif %}{% endfor %}{% if grupo.tipo == 'conyuges' %}, ambos domiciliados físicamente en {{ grupo.direccion }}{% endif %}{% if not loop.last %}; y, {% endif %}{% endfor %}; a quien en adelante se le denominará como "LA PARTE VENDEDORA"; y, por otra, {% for grupo in grupos_compradores %}{% if grupo.tipo == 'conyuges' %}los cónyuges señores: {% elif grupo.es_empresa %}{% else %}{% if grupo.personas[0].genero == 'femenino' %}la señora: {% else %}el señor: {% endif %}{% endif %}{% for p in grupo.personas %}{{ loop.index + loop.index0 + num_vendedores }}.- {% if grupo.es_empresa %}La compañía {{ p.razon_social }}, con RUC número {{ p.ruc_palabras }} ({{ p.ruc }}), representada legalmente por su {{ p.rep_cargo }}, {{ p.rep_articulo }} {{ p.rep_nombre_completo }}, portador de la cédula de ciudadanía número {{ p.rep_cedula_palabras }} ({{ p.rep_cedula }}), de nacionalidad {{ p.rep_nacionalidad }}, de estado civil {{ p.rep_estado_civil }}, de {{ p.rep_edad_palabras }} años de edad, {{ p.rep_profesion_ocupacion }}, domiciliado físicamente en {{ p.rep_direccion }}{% if p.rep_email %}, con domicilio electrónico en el correo {{ p.rep_email }}{% endif %}{% else %}{{ p.nombres_completos }}, portador{% if p.genero == 'femenino' %}a{% endif %} de la cédula de ciudadanía número {{ p.cedula_palabras }} ({{ p.cedula }}), de nacionalidad {{ p.nacionalidad }}, de estado civil {{ p.estado_civil }}, de {{ p.edad_palabras }} años de edad{% if p.profesion %}, de profesión {{ p.profesion }}{% endif %}{% if p.ocupacion %}, de ocupación {{ p.ocupacion }}{% endif %}{% if p.telefono %}, teléfono celular número {{ p.telefono_palabras }} ({{ p.telefono }}){% endif %}{% if p.email %}, con domicilio electrónico en el correo {{ p.email }}{% endif %}{% if grupo.tipo != 'conyuges' %}, domiciliado{% if p.genero == 'femenino' %}a{% endif %} físicamente en {{ grupo.direccion }}{% endif %}, por sus propios y personales derechos{% endif %}{% if not loop.last %}; y, {% endif %}{% endfor %}{% if grupo.tipo == 'conyuges' %}, ambos domiciliados físicamente en {{ grupo.direccion }}{% endif %}{% if not loop.last %}; y, {% endif %}{% endfor %}; a quien en adelante se le denominará como "LA PARTE COMPRADORA".</w:t>
+      </w:r>
+    </w:p>
+    <w:p>
+      <w:r>
+        <w:t xml:space="preserve"/>
+      </w:r>
+    </w:p>
+    <w:p>
+      <w:pPr>
+        <w:jc w:val="both"/>
+      </w:pPr>
+      <w:r>
+        <w:t xml:space="preserve">"LA PARTE VENDEDORA" y "LA PARTE COMPRADORA" son mayores de edad, legalmente capaces para contratar y obligarse.</w:t>
+      </w:r>
+    </w:p>
+    <w:p>
+      <w:r>
+        <w:t xml:space="preserve"/>
+      </w:r>
+    </w:p>
+    <w:p>
+      <w:pPr>
+        <w:jc w:val="both"/>
+      </w:pPr>
+      <w:r>
+        <w:t xml:space="preserve">SEGUNDA.- ANTECEDENTES.- {% for predio in predios %}2.{{ loop.index }}.- LA PARTE VENDEDORA es propietaria de {% if predio.es_compuesto %}{% for inmueble in predio.inmuebles %}{% if inmueble.tipo == 'Otro' %}{{ inmueble.tipo_otro }}{% else %}{{ inmueble.tipo }}{% endif %} {{ inmueble.numero_palabras }}{% if inmueble.nivel %}, nivel {{ inmueble.nivel }}{% endif %}{% if inmueble.area_cubierta %}, área cubierta {{ inmueble.area_cubierta_palabras }} metros cuadrados{% endif %}{% if inmueble.area_descubierta %}, área descubierta {{ inmueble.area_descubierta_palabras }} metros cuadrados{% endif %}, con una alícuota parcial de {{ inmueble.alicuota_parcial_palabras }}; {% endfor %}que juntos conforman una alícuota total de {{ predio.alicuota_total_palabras }}, forma parte del {% else %}{% for inmueble in predio.inmuebles %}{% if inmueble.tipo == 'Otro' %}{{ inmueble.tipo_otro }}{% else %}{{ inmueble.tipo }}{% endif %} {{ inmueble.numero_palabras }}{% if inmueble.nivel %}, nivel {{ inmueble.nivel }}{% endif %}{% if inmueble.area_cubierta %}, área cubierta {{ inmueble.area_cubierta_palabras }} metros cuadrados{% endif %}{% if inmueble.area_descubierta %}, área descubierta {{ inmueble.area_descubierta_palabras }} metros cuadrados{% endif %}, con una alícuota de {{ inmueble.alicuota_parcial_palabras }}{% endfor %}, del {% endif %}{{ nombre_conjunto }}{% if predio.tiene_numero_predial %}, con número predial municipal {{ predio.numero_predial }}{% endif %}, construido en el {{ ubicacion.lote }} número {{ ubicacion.numero_palabras }}, situado en la parroquia {{ ubicacion.parroquia }}, cantón {{ ubicacion.canton }}, provincia de {{ ubicacion.provincia }}.{% endfor %}</w:t>
+      </w:r>
+    </w:p>
+    <w:p>
+      <w:r>
+        <w:t xml:space="preserve"/>
+      </w:r>
+    </w:p>
+    <w:p>
+      <w:pPr>
+        <w:jc w:val="both"/>
+      </w:pPr>
+      <w:r>
+        <w:t xml:space="preserve">{% if historia_manual %}{{ historia_texto|richtext }}{% else %}2.{{ predios|length + 1 }}.- LA PARTE VENDEDORA, {% if historia.titulo == 'sucesion' %}{{ historia.nombre_causante }}, adquirió por {{ historia.tipo_sucesion }}, {% else %}adquirió mediante {{ historia.titulo_otro if historia.titulo == 'otro' else historia.titulo }}, {% endif %}a {{ historia.adquirido_de }}, según escritura pública otorgada el {{ historia.fecha_otorgamiento }}, ante la Notaría {% if historia.es_suplente %}Suplente {% endif %}{{ historia.numero_notaria_palabras }} del cantón {{ historia.canton_notaria }}, {{ historia.notario }}, {% if historia.mismo_canton %}e inscrita en el Registro de la Propiedad el {{ historia.fecha_inscripcion }}, del mismo cantón.{% else %}e inscrita en el Registro de la Propiedad el {{ historia.fecha_inscripcion }}, del cantón {{ historia.canton_inscripcion }}.{% endif %}{% if historia.es_sucesion %} Por su parte, el causante adquirió la propiedad por {{ historia.causante_titulo_otro if historia.causante_titulo == 'otro' else historia.causante_titulo }}, a {{ historia.causante_adquirido_de }}, según escritura pública otorgada el {{ historia.causante_fecha_otorgamiento }}, ante la Notaría {% if historia.causante_es_suplente %}Suplente {% endif %}{{ historia.causante_numero_notaria_palabras }} del cantón {{ historia.causante_canton_notaria }}, {{ historia.causante_notario }}, {% if historia.causante_mismo_canton %}e inscrita en el Registro de la Propiedad el {{ historia.causante_fecha_inscripcion }}, del mismo cantón.{% else %}e inscrita en el Registro de la Propiedad el {{ historia.causante_fecha_inscripcion }}, del cantón {{ historia.causante_canton_inscripcion }}.{% endif %}{% endif %}{% endif %}</w:t>
+      </w:r>
+    </w:p>
+    <w:p>
+      <w:r>
+        <w:t xml:space="preserve"/>
+      </w:r>
+    </w:p>
+    <w:p>
+      <w:pPr>
+        <w:jc w:val="both"/>
+      </w:pPr>
+      <w:r>
+        <w:t xml:space="preserve">{% if es_horizontal %}{% if declaratoria_manual %}{{ declaratoria_texto|richtext }}{% else %}2.{{ predios|length + 2 }}.- El inmueble donde se encuentra fincado el bien objeto de esta compraventa fue declarado en Propiedad Horizontal según escritura pública otorgada el {{ declaratoria.fecha_otorgamiento }}, ante la Notaría {% if declaratoria.es_suplente %}Suplente {% endif %}{{ declaratoria.numero_notaria_palabras }} del cantón {{ declaratoria.canton_notaria }}{% if declaratoria.notario %}, {{ declaratoria.notario }}{% endif %}, debidamente inscrita en el Registro de la Propiedad del mismo cantón el {{ declaratoria.fecha_inscripcion }}.{% endif %}{% endif %}</w:t>
+      </w:r>
+    </w:p>
+    <w:p>
+      <w:r>
+        <w:t xml:space="preserve"/>
+      </w:r>
+    </w:p>
+    <w:p>
+      <w:pPr>
+        <w:jc w:val="both"/>
+      </w:pPr>
+      <w:r>
+        <w:t xml:space="preserve">2.{{ predios|length + 3 }}.- Los linderos generales del inmueble son los siguientes: NORTE: En una extensión de {{ linderos.norte_metros_palabras }} metros con {{ linderos.norte_colindancia }}; SUR: En una extensión de {{ linderos.sur_metros_palabras }} metros con {{ linderos.sur_colindancia }}; ESTE: En una extensión de {{ linderos.este_metros_palabras }} metros con {{ linderos.este_colindancia }}; OESTE: En una extensión de {{ linderos.oeste_metros_palabras }} metros con {{ linderos.oeste_colindancia }}. SUPERFICIE: {{ linderos.superficie_palabras }} metros cuadrados{% if tiene_linderos_especificos %}; mientras que, los linderos específicos constan en la declaratoria de Propiedad Horizontal referida y en la escritura de compraventa que constituye el título de dominio que posee la parte VENDEDORA y cuya parte pertinente se agrega a la presente escritura como habilitante{% endif %}.</w:t>
       </w:r>
     </w:p>
     <w:p>
@@ -108,20 +121,20 @@
         <w:jc w:val="both"/>
       </w:pPr>
       <w:r>
-        <w:t xml:space="preserve">TERCERA.- COMPRAVENTA.- Con los antecedentes expuestos en la cláusula anterior, la parte "VENDEDORA", {% for grupo in grupos_vendedores %}{% if grupo.es_empresa %}la compañía {{ grupo.personas[0].razon_social }}{% else %}{% for p in grupo.personas %}{{ p.nombres_completos }}{% if not loop.last %} y {% endif %}{% endfor %}{% endif %}{% if not loop.last %} y {% endif %}{% endfor %}, da en venta real y enajenación perpetua, en favor de la "COMPRADORA" {% for grupo in grupos_compradores %}{% if grupo.es_empresa %}la compañía {{ grupo.personas[0].razon_social }}{% else %}{% for p in grupo.personas %}{{ p.nombres_completos }}{% if not loop.last %} y {% endif %}{% endfor %}{% endif %}{% if not loop.last %} y {% endif %}{% endfor %}, {% if es_horizontal %}{% for predio in predios %}{% if predio.es_compuesto %}{% for inmueble in predio.inmuebles %}{% if inmueble.tipo == 'Otro' %}{{ inmueble.tipo_otro }}{% else %}{{ inmueble.tipo }}{% endif %} {{ inmueble.numero_palabras }}, con una alícuota parcial de {{ inmueble.alicuota_parcial_palabras }}; {% endfor %}que juntos conforman una alícuota total de {{ predio.alicuota_total_palabras }}, forma parte del {% else %}{% for inmueble in predio.inmuebles %}{% if inmueble.tipo == 'Otro' %}{{ inmueble.tipo_otro }}{% else %}{{ inmueble.tipo }}{% endif %} {{ inmueble.numero_palabras }}, con una alícuota de {{ inmueble.alicuota_parcial_palabras }}; {% endfor %}del {% endif %}{{ nombre_conjunto }}, construido en el {{ ubicacion.lote }} número {{ ubicacion.numero_palabras }}, situado en la parroquia {{ ubicacion.parroquia }}, cantón {{ ubicacion.canton }}, provincia de {{ ubicacion.provincia }}{% endfor %}{% else %}el inmueble antes descrito{% endif %}, dentro de sus linderos generales y específicos y cuyos demás antecedentes de dominio constan claramente detallados en la cláusula de antecedentes.</w:t>
-      </w:r>
-    </w:p>
-    <w:p>
-      <w:r>
-        <w:t xml:space="preserve"/>
-      </w:r>
-    </w:p>
-    <w:p>
-      <w:pPr>
-        <w:jc w:val="both"/>
-      </w:pPr>
-      <w:r>
-        <w:t xml:space="preserve">{% if precio_manual %}{{ precio_texto|richtext }}{% else %}CUARTA.- PRECIO Y FORMA DE PAGO.- El precio de venta que de común acuerdo han establecido las partes por el inmueble antes descrito, es la suma de {{ precio.total_palabras }}. El precio acordado es fijo, pactado exclusivamente en dólares de los Estados Unidos de América, por lo tanto no se podrá hacer su pago en ningún otro tipo de moneda; contiene el inmueble en su totalidad como cuerpo cierto y singularizado y no podrá ser objeto de reajustes por motivo alguno, mismo que es pagado por la parte COMPRADORA de la siguiente forma: {% for parte in precio.partes %}{{ parte.letra }}).- La suma de {{ parte.monto_palabras }}{% if parte.es_cuotas %}, pagaderos en {{ parte.numero_cuotas_palabras }} cuotas {{ parte.periodicidad }}s de {{ parte.valor_cuota_palabras }} cada una{% endif %}{% if parte.momento_pago == 'ya_pagado' %}, se cancelaron utilizando el sistema financiero ecuatoriano con anterioridad a la celebración de este contrato mediante {{ parte.medio_pago }}{% if parte.detalle_transferencia %}, {{ parte.detalle_transferencia }}{% endif %}, cuyos comprobantes se habilitan en copias certificadas, valor que es aceptado por la parte VENDEDORA a su entera satisfacción{% elif parte.momento_pago == 'al_firmar' %}, son pagados mediante {{ parte.medio_pago }}{% if parte.detalle_transferencia %}, {{ parte.detalle_transferencia }}{% endif %} en forma concomitante con la firma de las escrituras de compraventa definitivas, cuyos habilitantes en copia certificada se adjuntan, valor que es aceptado por la parte VENDEDORA a su entera satisfacción{% elif parte.momento_pago == 'despues_inscribir' %}, serán pagados mediante {{ parte.medio_pago }}{% if parte.detalle_transferencia %}, {{ parte.detalle_transferencia }}{% endif %} inmediatamente después de que se inscriba el presente título en el Registro de la Propiedad, valor que es aceptado por la parte VENDEDORA a su entera satisfacción{% endif %}{% if parte.es_credito %}, con fondos provenientes del crédito hipotecario otorgado por {{ parte.entidad_credito }}{% endif %}; y por tal motivo no tendrán nada que reclamar en el futuro por este concepto{% if not loop.last %}; y, {% else %}.{% endif %}{% endfor %}{% endif %}</w:t>
+        <w:t xml:space="preserve">TERCERA.- COMPRAVENTA.- Con los antecedentes expuestos en la cláusula anterior, "LA PARTE VENDEDORA" {% for grupo in grupos_vendedores %}{% if grupo.es_empresa %}la compañía {{ grupo.personas[0].razon_social }}{% else %}{% for p in grupo.personas %}{{ p.nombres_completos }}{% if not loop.last %} y {% endif %}{% endfor %}{% endif %}{% if not loop.last %} y {% endif %}{% endfor %}, da en venta real y enajenación perpetua, en favor de "LA PARTE COMPRADORA" {% for grupo in grupos_compradores %}{% if grupo.es_empresa %}la compañía {{ grupo.personas[0].razon_social }}{% else %}{% for p in grupo.personas %}{{ p.nombres_completos }}{% if not loop.last %} y {% endif %}{% endfor %}{% endif %}{% if not loop.last %} y {% endif %}{% endfor %}, {% if es_horizontal %}{% for predio in predios %}{% if predio.es_compuesto %}{% for inmueble in predio.inmuebles %}{% if inmueble.tipo == 'Otro' %}{{ inmueble.tipo_otro }}{% else %}{{ inmueble.tipo }}{% endif %} {{ inmueble.numero_palabras }}, con una alícuota parcial de {{ inmueble.alicuota_parcial_palabras }}; {% endfor %}que juntos conforman una alícuota total de {{ predio.alicuota_total_palabras }}, forma parte del {% else %}{% for inmueble in predio.inmuebles %}{% if inmueble.tipo == 'Otro' %}{{ inmueble.tipo_otro }}{% else %}{{ inmueble.tipo }}{% endif %} {{ inmueble.numero_palabras }}, con una alícuota de {{ inmueble.alicuota_parcial_palabras }}; {% endfor %}del {% endif %}{{ nombre_conjunto }}, construido en el {{ ubicacion.lote }} número {{ ubicacion.numero_palabras }}, situado en la parroquia {{ ubicacion.parroquia }}, cantón {{ ubicacion.canton }}, provincia de {{ ubicacion.provincia }}{% if not loop.last %}; y, {% endif %}{% endfor %}{% else %}el inmueble antes descrito{% endif %}, dentro de sus linderos generales y específicos y cuyos demás antecedentes de dominio constan claramente detallados en la cláusula de antecedentes.</w:t>
+      </w:r>
+    </w:p>
+    <w:p>
+      <w:r>
+        <w:t xml:space="preserve"/>
+      </w:r>
+    </w:p>
+    <w:p>
+      <w:pPr>
+        <w:jc w:val="both"/>
+      </w:pPr>
+      <w:r>
+        <w:t xml:space="preserve">{% if precio_manual %}{{ precio_texto|richtext }}{% else %}CUARTA.- PRECIO Y FORMA DE PAGO.- El precio de venta que de común acuerdo han establecido las partes por el inmueble antes descrito, es la suma de {{ precio.total_palabras }}. El precio acordado es fijo, pactado exclusivamente en dólares de los Estados Unidos de América, por lo tanto no se podrá hacer su pago en ningún otro tipo de moneda; contiene el inmueble en su totalidad como cuerpo cierto y singularizado y no podrá ser objeto de reajustes por motivo alguno, mismo que es pagado por la parte COMPRADORA de la siguiente forma: {% for parte in precio.partes %}{{ parte.letra }}).- La suma de {{ parte.monto_palabras }}{% if parte.es_cuotas %}, pagaderos en {{ parte.numero_cuotas_palabras }} cuotas {{ parte.periodicidad }}s de {{ parte.valor_cuota_palabras }} cada una{% endif %}{% if parte.momento_pago == 'ya_pagado' %}, se cancelaron utilizando el sistema financiero ecuatoriano con anterioridad a la celebración de este contrato mediante {{ parte.medio_pago }}{% if parte.detalle_transferencia %}, {{ parte.detalle_transferencia }}{% endif %}, cuyos comprobantes se habilitan en copias certificadas, valor que es aceptado por la parte VENDEDORA a su entera satisfacción{% elif parte.momento_pago == 'al_firmar' %}, son pagados mediante {{ parte.medio_pago }}{% if parte.detalle_transferencia %}, {{ parte.detalle_transferencia }}{% endif %} en forma concomitante con la firma de las escrituras de compraventa definitivas, cuyos habilitantes en copia certificada se adjuntan, valor que es aceptado por la parte VENDEDORA a su entera satisfacción{% elif parte.momento_pago == 'despues_inscribir' %}, serán pagados mediante {{ parte.medio_pago }}{% if parte.detalle_transferencia %}, {{ parte.detalle_transferencia }}{% endif %} inmediatamente después de que se inscriba el presente título en el Registro de la Propiedad, valor que es aceptado por la parte VENDEDORA a su entera satisfacción{% elif parte.momento_pago == 'otro' %}, serán pagados mediante {{ parte.medio_pago }}{% if parte.detalle_transferencia %}, {{ parte.detalle_transferencia }}{% endif %} el {{ parte.momento_pago_otro }}, valor que es aceptado por la parte VENDEDORA a su entera satisfacción{% endif %}{% if parte.es_credito %}, con fondos provenientes del crédito hipotecario otorgado por {{ parte.entidad_credito }}{% endif %}; y por tal motivo no tendrán nada que reclamar en el futuro por este concepto{% if not loop.last %}; y, {% else %}.{% endif %}{% endfor %}{% endif %}</w:t>
       </w:r>
     </w:p>
     <w:p>

</xml_diff>

<commit_message>
feat: historia de dominio soporta múltiples partes de adquisición y aclaratorias visibles
</commit_message>
<xml_diff>
--- a/backend/app/templates/minuta_compraventa.docx
+++ b/backend/app/templates/minuta_compraventa.docx
@@ -56,46 +56,46 @@
         <w:jc w:val="both"/>
       </w:pPr>
       <w:r>
-        <w:t xml:space="preserve">SEGUNDA.- ANTECEDENTES.- {% for predio in predios %}2.{{ loop.index }}.- LA PARTE VENDEDORA es propietaria de {% if predio.es_compuesto %}{% for inmueble in predio.inmuebles %}{% if inmueble.tipo == 'Otro' %}{{ inmueble.tipo_otro }}{% else %}{{ inmueble.tipo }}{% endif %} {{ inmueble.numero_palabras }}{% if inmueble.nivel %}, nivel {{ inmueble.nivel }}{% endif %}{% if inmueble.area_cubierta %}, área cubierta {{ inmueble.area_cubierta_palabras }} metros cuadrados{% endif %}{% if inmueble.area_descubierta %}, área descubierta {{ inmueble.area_descubierta_palabras }} metros cuadrados{% endif %}, con una alícuota parcial de {{ inmueble.alicuota_parcial_palabras }}; {% endfor %}que juntos conforman una alícuota total de {{ predio.alicuota_total_palabras }}, forma parte del {% else %}{% for inmueble in predio.inmuebles %}{% if inmueble.tipo == 'Otro' %}{{ inmueble.tipo_otro }}{% else %}{{ inmueble.tipo }}{% endif %} {{ inmueble.numero_palabras }}{% if inmueble.nivel %}, nivel {{ inmueble.nivel }}{% endif %}{% if inmueble.area_cubierta %}, área cubierta {{ inmueble.area_cubierta_palabras }} metros cuadrados{% endif %}{% if inmueble.area_descubierta %}, área descubierta {{ inmueble.area_descubierta_palabras }} metros cuadrados{% endif %}, con una alícuota de {{ inmueble.alicuota_parcial_palabras }}{% endfor %}, del {% endif %}{{ nombre_conjunto }}{% if predio.tiene_numero_predial %}, con número predial municipal {{ predio.numero_predial }}{% endif %}, construido en el {{ ubicacion.lote }} número {{ ubicacion.numero_palabras }}, situado en la parroquia {{ ubicacion.parroquia }}, cantón {{ ubicacion.canton }}, provincia de {{ ubicacion.provincia }}.{% endfor %}</w:t>
-      </w:r>
-    </w:p>
-    <w:p>
-      <w:r>
-        <w:t xml:space="preserve"/>
-      </w:r>
-    </w:p>
-    <w:p>
-      <w:pPr>
-        <w:jc w:val="both"/>
-      </w:pPr>
-      <w:r>
-        <w:t xml:space="preserve">{% if historia_manual %}{{ historia_texto|richtext }}{% else %}2.{{ predios|length + 1 }}.- LA PARTE VENDEDORA, {% if historia.titulo == 'sucesion' %}{{ historia.nombre_causante }}, adquirió por {{ historia.tipo_sucesion }}, {% else %}adquirió mediante {{ historia.titulo_otro if historia.titulo == 'otro' else historia.titulo }}, {% endif %}a {{ historia.adquirido_de }}, según escritura pública otorgada el {{ historia.fecha_otorgamiento }}, ante la Notaría {% if historia.es_suplente %}Suplente {% endif %}{{ historia.numero_notaria_palabras }} del cantón {{ historia.canton_notaria }}, {{ historia.notario }}, {% if historia.mismo_canton %}e inscrita en el Registro de la Propiedad el {{ historia.fecha_inscripcion }}, del mismo cantón.{% else %}e inscrita en el Registro de la Propiedad el {{ historia.fecha_inscripcion }}, del cantón {{ historia.canton_inscripcion }}.{% endif %}{% if historia.es_sucesion %} Por su parte, el causante adquirió la propiedad por {{ historia.causante_titulo_otro if historia.causante_titulo == 'otro' else historia.causante_titulo }}, a {{ historia.causante_adquirido_de }}, según escritura pública otorgada el {{ historia.causante_fecha_otorgamiento }}, ante la Notaría {% if historia.causante_es_suplente %}Suplente {% endif %}{{ historia.causante_numero_notaria_palabras }} del cantón {{ historia.causante_canton_notaria }}, {{ historia.causante_notario }}, {% if historia.causante_mismo_canton %}e inscrita en el Registro de la Propiedad el {{ historia.causante_fecha_inscripcion }}, del mismo cantón.{% else %}e inscrita en el Registro de la Propiedad el {{ historia.causante_fecha_inscripcion }}, del cantón {{ historia.causante_canton_inscripcion }}.{% endif %}{% endif %}{% endif %}</w:t>
-      </w:r>
-    </w:p>
-    <w:p>
-      <w:r>
-        <w:t xml:space="preserve"/>
-      </w:r>
-    </w:p>
-    <w:p>
-      <w:pPr>
-        <w:jc w:val="both"/>
-      </w:pPr>
-      <w:r>
-        <w:t xml:space="preserve">{% if es_horizontal %}{% if declaratoria_manual %}{{ declaratoria_texto|richtext }}{% else %}2.{{ predios|length + 2 }}.- El inmueble donde se encuentra fincado el bien objeto de esta compraventa fue declarado en Propiedad Horizontal según escritura pública otorgada el {{ declaratoria.fecha_otorgamiento }}, ante la Notaría {% if declaratoria.es_suplente %}Suplente {% endif %}{{ declaratoria.numero_notaria_palabras }} del cantón {{ declaratoria.canton_notaria }}{% if declaratoria.notario %}, {{ declaratoria.notario }}{% endif %}, debidamente inscrita en el Registro de la Propiedad del mismo cantón el {{ declaratoria.fecha_inscripcion }}.{% endif %}{% endif %}</w:t>
-      </w:r>
-    </w:p>
-    <w:p>
-      <w:r>
-        <w:t xml:space="preserve"/>
-      </w:r>
-    </w:p>
-    <w:p>
-      <w:pPr>
-        <w:jc w:val="both"/>
-      </w:pPr>
-      <w:r>
-        <w:t xml:space="preserve">2.{{ predios|length + 3 }}.- Los linderos generales del inmueble son los siguientes: NORTE: En una extensión de {{ linderos.norte_metros_palabras }} metros con {{ linderos.norte_colindancia }}; SUR: En una extensión de {{ linderos.sur_metros_palabras }} metros con {{ linderos.sur_colindancia }}; ESTE: En una extensión de {{ linderos.este_metros_palabras }} metros con {{ linderos.este_colindancia }}; OESTE: En una extensión de {{ linderos.oeste_metros_palabras }} metros con {{ linderos.oeste_colindancia }}. SUPERFICIE: {{ linderos.superficie_palabras }} metros cuadrados{% if tiene_linderos_especificos %}; mientras que, los linderos específicos constan en la declaratoria de Propiedad Horizontal referida y en la escritura de compraventa que constituye el título de dominio que posee la parte VENDEDORA y cuya parte pertinente se agrega a la presente escritura como habilitante{% endif %}.</w:t>
+        <w:t xml:space="preserve">SEGUNDA.- ANTECEDENTES.- {% for predio in predios %}2.{{ loop.index }}.- LA PARTE VENDEDORA es propietaria de {% if predio.es_compuesto %}{% for inmueble in predio.inmuebles %}{% if inmueble.tipo == 'Otro' %}{{ inmueble.tipo_otro }}{% else %}{{ inmueble.tipo }}{% endif %} {{ inmueble.numero_palabras }}{% if inmueble.nivel %}, nivel {{ inmueble.nivel }}{% endif %}{% if inmueble.area_cubierta %}, área cubierta {{ inmueble.area_cubierta_palabras }}{% endif %}{% if inmueble.area_descubierta %}, área descubierta {{ inmueble.area_descubierta_palabras }}{% endif %}, con una alícuota parcial de {{ inmueble.alicuota_parcial_palabras }}; {% endfor %}que juntos conforman una alícuota total de {{ predio.alicuota_total_palabras }}, forma parte del {% else %}{% for inmueble in predio.inmuebles %}{% if inmueble.tipo == 'Otro' %}{{ inmueble.tipo_otro }}{% else %}{{ inmueble.tipo }}{% endif %} {{ inmueble.numero_palabras }}{% if inmueble.nivel %}, nivel {{ inmueble.nivel }}{% endif %}{% if inmueble.area_cubierta %}, área cubierta {{ inmueble.area_cubierta_palabras }}{% endif %}{% if inmueble.area_descubierta %}, área descubierta {{ inmueble.area_descubierta_palabras }}{% endif %}, con una alícuota de {{ inmueble.alicuota_parcial_palabras }}{% endfor %}, del {% endif %}{{ nombre_conjunto }}{% if predio.tiene_numero_predial %}, con número predial municipal {{ predio.numero_predial_palabras }}{% endif %}, construido en el {{ ubicacion.lote }} número {{ ubicacion.numero_palabras }}, situado en la parroquia {{ ubicacion.parroquia }}, cantón {{ ubicacion.canton }}, provincia de {{ ubicacion.provincia }}.{% endfor %}</w:t>
+      </w:r>
+    </w:p>
+    <w:p>
+      <w:r>
+        <w:t xml:space="preserve"/>
+      </w:r>
+    </w:p>
+    <w:p>
+      <w:pPr>
+        <w:jc w:val="both"/>
+      </w:pPr>
+      <w:r>
+        <w:t xml:space="preserve">{% if historia_manual %}{{ historia_texto|richtext }}{% else %}{% for parte in historia_partes %}2.{{ predios|length + loop.index }}.- LA PARTE VENDEDORA, {% if parte.tiene_porcentaje %}en el {{ parte.porcentaje_palabras }} de las alícuotas, {% endif %}{% if parte.titulo == 'sucesion' %}{{ parte.nombre_causante }}, adquirió por {{ parte.tipo_sucesion }}, {% else %}adquirió mediante {{ parte.titulo_otro if parte.titulo == 'otro' else parte.titulo }}, {% endif %}a {{ parte.adquirido_de }}, según escritura pública otorgada el {{ parte.fecha_otorgamiento }}, ante la Notaría {% if parte.es_suplente %}Suplente {% endif %}{{ parte.numero_notaria_palabras }} del cantón {{ parte.canton_notaria }}, {{ parte.notario }}, {% if parte.mismo_canton %}e inscrita en el Registro de la Propiedad el {{ parte.fecha_inscripcion }}, del mismo cantón.{% else %}e inscrita en el Registro de la Propiedad el {{ parte.fecha_inscripcion }}, del cantón {{ parte.canton_inscripcion }}.{% endif %}{% if parte.es_sucesion %} Por su parte, el causante adquirió la propiedad por {{ parte.causante_titulo_otro if parte.causante_titulo == 'otro' else parte.causante_titulo }}, a {{ parte.causante_adquirido_de }}, según escritura pública otorgada el {{ parte.causante_fecha_otorgamiento }}, ante la Notaría {% if parte.causante_es_suplente %}Suplente {% endif %}{{ parte.causante_numero_notaria_palabras }} del cantón {{ parte.causante_canton_notaria }}, {{ parte.causante_notario }}, {% if parte.causante_mismo_canton %}e inscrita en el Registro de la Propiedad el {{ parte.causante_fecha_inscripcion }}, del mismo cantón.{% else %}e inscrita en el Registro de la Propiedad el {{ parte.causante_fecha_inscripcion }}, del cantón {{ parte.causante_canton_inscripcion }}.{% endif %}{% endif %} {% if parte.aclaratorias %}{% for acl in parte.aclaratorias %}Que mediante escritura pública de aclaración{% if acl.titulo %} y {{ acl.titulo_otro if acl.titulo == 'otro' else acl.titulo }}{% endif %} otorgada el {{ acl.fecha_otorgamiento }}, ante la Notaría {% if acl.es_suplente %}Suplente {% endif %}{{ acl.numero_notaria_palabras }} del cantón {{ acl.canton_notaria }}, {{ acl.notario }}, {% if acl.mismo_canton %}e inscrita en el Registro de la Propiedad el {{ acl.fecha_inscripcion }}, del mismo cantón{% else %}e inscrita en el Registro de la Propiedad el {{ acl.fecha_inscripcion }}, del cantón {{ acl.canton_inscripcion }}{% endif %}, se aclaró y modificó la escritura antes referida{% if acl.descripcion %}, de la siguiente manera: {{ acl.descripcion }}{% endif %}. {% if acl.aclaratorias %}{% for acl2 in acl.aclaratorias %}Que mediante escritura pública de aclaración{% if acl2.titulo %} y {{ acl2.titulo_otro if acl2.titulo == 'otro' else acl2.titulo }}{% endif %} otorgada el {{ acl2.fecha_otorgamiento }}, ante la Notaría {% if acl2.es_suplente %}Suplente {% endif %}{{ acl2.numero_notaria_palabras }} del cantón {{ acl2.canton_notaria }}, {{ acl2.notario }}, {% if acl2.mismo_canton %}e inscrita en el Registro de la Propiedad el {{ acl2.fecha_inscripcion }}, del mismo cantón{% else %}e inscrita en el Registro de la Propiedad el {{ acl2.fecha_inscripcion }}, del cantón {{ acl2.canton_inscripcion }}{% endif %}, se aclaró y modificó la escritura antes referida{% if acl2.descripcion %}, de la siguiente manera: {{ acl2.descripcion }}{% endif %}. {% endfor %}{% endif %}{% endfor %}{% endif %}{% endfor %}{% endif %}</w:t>
+      </w:r>
+    </w:p>
+    <w:p>
+      <w:r>
+        <w:t xml:space="preserve"/>
+      </w:r>
+    </w:p>
+    <w:p>
+      <w:pPr>
+        <w:jc w:val="both"/>
+      </w:pPr>
+      <w:r>
+        <w:t xml:space="preserve">{% if es_horizontal %}{% if declaratoria_manual %}{{ declaratoria_texto|richtext }}{% else %}2.{{ predios|length + historia_partes|length + 1 }}.- El inmueble donde se encuentra fincado el bien objeto de esta compraventa fue declarado en Propiedad Horizontal según escritura pública otorgada el {{ declaratoria.fecha_otorgamiento }}, ante la Notaría {% if declaratoria.es_suplente %}Suplente {% endif %}{{ declaratoria.numero_notaria_palabras }} del cantón {{ declaratoria.canton_notaria }}{% if declaratoria.notario %}, {{ declaratoria.notario }}{% endif %}, debidamente inscrita en el Registro de la Propiedad del mismo cantón el {{ declaratoria.fecha_inscripcion }}. {% if declaratoria.aclaratorias %}{% for acl in declaratoria.aclaratorias %}Que mediante escritura pública de aclaración otorgada el {{ acl.fecha_otorgamiento }}, ante la Notaría {% if acl.es_suplente %}Suplente {% endif %}{{ acl.numero_notaria_palabras }} del cantón {{ acl.canton_notaria }}, {{ acl.notario }}, {% if acl.mismo_canton %}e inscrita en el Registro de la Propiedad el {{ acl.fecha_inscripcion }}, del mismo cantón{% else %}e inscrita en el Registro de la Propiedad el {{ acl.fecha_inscripcion }}, del cantón {{ acl.canton_inscripcion }}{% endif %}, se aclaró y modificó la declaratoria de propiedad horizontal antes referida{% if acl.descripcion %}, de la siguiente manera: {{ acl.descripcion }}{% endif %}. {% if acl.aclaratorias %}{% for acl2 in acl.aclaratorias %}Que mediante escritura pública de aclaración otorgada el {{ acl2.fecha_otorgamiento }}, ante la Notaría {% if acl2.es_suplente %}Suplente {% endif %}{{ acl2.numero_notaria_palabras }} del cantón {{ acl2.canton_notaria }}, {{ acl2.notario }}, {% if acl2.mismo_canton %}e inscrita en el Registro de la Propiedad el {{ acl2.fecha_inscripcion }}, del mismo cantón{% else %}e inscrita en el Registro de la Propiedad el {{ acl2.fecha_inscripcion }}, del cantón {{ acl2.canton_inscripcion }}{% endif %}, se aclaró y modificó la declaratoria de propiedad horizontal antes referida{% if acl2.descripcion %}, de la siguiente manera: {{ acl2.descripcion }}{% endif %}. {% endfor %}{% endif %}{% endfor %}{% endif %}{% endif %}{% endif %}</w:t>
+      </w:r>
+    </w:p>
+    <w:p>
+      <w:r>
+        <w:t xml:space="preserve"/>
+      </w:r>
+    </w:p>
+    <w:p>
+      <w:pPr>
+        <w:jc w:val="both"/>
+      </w:pPr>
+      <w:r>
+        <w:t xml:space="preserve">2.{{ predios|length + historia_partes|length + 2 }}.- Los linderos generales del inmueble son los siguientes: NORTE: En una extensión de {{ linderos.norte_metros_palabras }} metros con {{ linderos.norte_colindancia }}; SUR: En una extensión de {{ linderos.sur_metros_palabras }} metros con {{ linderos.sur_colindancia }}; ESTE: En una extensión de {{ linderos.este_metros_palabras }} metros con {{ linderos.este_colindancia }}; OESTE: En una extensión de {{ linderos.oeste_metros_palabras }} metros con {{ linderos.oeste_colindancia }}. SUPERFICIE: {{ linderos.superficie_palabras }} metros cuadrados{% if tiene_linderos_especificos %}; mientras que, los linderos específicos constan en la declaratoria de Propiedad Horizontal referida y en la escritura de compraventa que constituye el título de dominio que posee la parte VENDEDORA y cuya parte pertinente se agrega a la presente escritura como habilitante{% endif %}.</w:t>
       </w:r>
     </w:p>
     <w:p>
@@ -121,20 +121,20 @@
         <w:jc w:val="both"/>
       </w:pPr>
       <w:r>
-        <w:t xml:space="preserve">TERCERA.- COMPRAVENTA.- Con los antecedentes expuestos en la cláusula anterior, "LA PARTE VENDEDORA" {% for grupo in grupos_vendedores %}{% if grupo.es_empresa %}la compañía {{ grupo.personas[0].razon_social }}{% else %}{% for p in grupo.personas %}{{ p.nombres_completos }}{% if not loop.last %} y {% endif %}{% endfor %}{% endif %}{% if not loop.last %} y {% endif %}{% endfor %}, da en venta real y enajenación perpetua, en favor de "LA PARTE COMPRADORA" {% for grupo in grupos_compradores %}{% if grupo.es_empresa %}la compañía {{ grupo.personas[0].razon_social }}{% else %}{% for p in grupo.personas %}{{ p.nombres_completos }}{% if not loop.last %} y {% endif %}{% endfor %}{% endif %}{% if not loop.last %} y {% endif %}{% endfor %}, {% if es_horizontal %}{% for predio in predios %}{% if predio.es_compuesto %}{% for inmueble in predio.inmuebles %}{% if inmueble.tipo == 'Otro' %}{{ inmueble.tipo_otro }}{% else %}{{ inmueble.tipo }}{% endif %} {{ inmueble.numero_palabras }}, con una alícuota parcial de {{ inmueble.alicuota_parcial_palabras }}; {% endfor %}que juntos conforman una alícuota total de {{ predio.alicuota_total_palabras }}, forma parte del {% else %}{% for inmueble in predio.inmuebles %}{% if inmueble.tipo == 'Otro' %}{{ inmueble.tipo_otro }}{% else %}{{ inmueble.tipo }}{% endif %} {{ inmueble.numero_palabras }}, con una alícuota de {{ inmueble.alicuota_parcial_palabras }}; {% endfor %}del {% endif %}{{ nombre_conjunto }}, construido en el {{ ubicacion.lote }} número {{ ubicacion.numero_palabras }}, situado en la parroquia {{ ubicacion.parroquia }}, cantón {{ ubicacion.canton }}, provincia de {{ ubicacion.provincia }}{% if not loop.last %}; y, {% endif %}{% endfor %}{% else %}el inmueble antes descrito{% endif %}, dentro de sus linderos generales y específicos y cuyos demás antecedentes de dominio constan claramente detallados en la cláusula de antecedentes.</w:t>
-      </w:r>
-    </w:p>
-    <w:p>
-      <w:r>
-        <w:t xml:space="preserve"/>
-      </w:r>
-    </w:p>
-    <w:p>
-      <w:pPr>
-        <w:jc w:val="both"/>
-      </w:pPr>
-      <w:r>
-        <w:t xml:space="preserve">{% if precio_manual %}{{ precio_texto|richtext }}{% else %}CUARTA.- PRECIO Y FORMA DE PAGO.- El precio de venta que de común acuerdo han establecido las partes por el inmueble antes descrito, es la suma de {{ precio.total_palabras }}. El precio acordado es fijo, pactado exclusivamente en dólares de los Estados Unidos de América, por lo tanto no se podrá hacer su pago en ningún otro tipo de moneda; contiene el inmueble en su totalidad como cuerpo cierto y singularizado y no podrá ser objeto de reajustes por motivo alguno, mismo que es pagado por la parte COMPRADORA de la siguiente forma: {% for parte in precio.partes %}{{ parte.letra }}).- La suma de {{ parte.monto_palabras }}{% if parte.es_cuotas %}, pagaderos en {{ parte.numero_cuotas_palabras }} cuotas {{ parte.periodicidad }}s de {{ parte.valor_cuota_palabras }} cada una{% endif %}{% if parte.momento_pago == 'ya_pagado' %}, se cancelaron utilizando el sistema financiero ecuatoriano con anterioridad a la celebración de este contrato mediante {{ parte.medio_pago }}{% if parte.detalle_transferencia %}, {{ parte.detalle_transferencia }}{% endif %}, cuyos comprobantes se habilitan en copias certificadas, valor que es aceptado por la parte VENDEDORA a su entera satisfacción{% elif parte.momento_pago == 'al_firmar' %}, son pagados mediante {{ parte.medio_pago }}{% if parte.detalle_transferencia %}, {{ parte.detalle_transferencia }}{% endif %} en forma concomitante con la firma de las escrituras de compraventa definitivas, cuyos habilitantes en copia certificada se adjuntan, valor que es aceptado por la parte VENDEDORA a su entera satisfacción{% elif parte.momento_pago == 'despues_inscribir' %}, serán pagados mediante {{ parte.medio_pago }}{% if parte.detalle_transferencia %}, {{ parte.detalle_transferencia }}{% endif %} inmediatamente después de que se inscriba el presente título en el Registro de la Propiedad, valor que es aceptado por la parte VENDEDORA a su entera satisfacción{% elif parte.momento_pago == 'otro' %}, serán pagados mediante {{ parte.medio_pago }}{% if parte.detalle_transferencia %}, {{ parte.detalle_transferencia }}{% endif %} el {{ parte.momento_pago_otro }}, valor que es aceptado por la parte VENDEDORA a su entera satisfacción{% endif %}{% if parte.es_credito %}, con fondos provenientes del crédito hipotecario otorgado por {{ parte.entidad_credito }}{% endif %}; y por tal motivo no tendrán nada que reclamar en el futuro por este concepto{% if not loop.last %}; y, {% else %}.{% endif %}{% endfor %}{% endif %}</w:t>
+        <w:t xml:space="preserve">TERCERA.- COMPRAVENTA.- Con los antecedentes expuestos en la cláusula anterior, "LA PARTE VENDEDORA" da en venta real y enajenación perpetua, en favor de "LA PARTE COMPRADORA", {% if es_horizontal %}{% for predio in predios %}{% if predio.es_compuesto %}{% for inmueble in predio.inmuebles %}{% if inmueble.tipo == 'Otro' %}{{ inmueble.tipo_otro }}{% else %}{{ inmueble.tipo }}{% endif %} {{ inmueble.numero_palabras }}, con una alícuota parcial de {{ inmueble.alicuota_parcial_palabras }}; {% endfor %}que juntos conforman una alícuota total de {{ predio.alicuota_total_palabras }}, forma parte del {% else %}{% for inmueble in predio.inmuebles %}{% if inmueble.tipo == 'Otro' %}{{ inmueble.tipo_otro }}{% else %}{{ inmueble.tipo }}{% endif %} {{ inmueble.numero_palabras }}, con una alícuota de {{ inmueble.alicuota_parcial_palabras }}; {% endfor %}del {% endif %}{{ nombre_conjunto }}, construido en el {{ ubicacion.lote }} número {{ ubicacion.numero_palabras }}, situado en la parroquia {{ ubicacion.parroquia }}, cantón {{ ubicacion.canton }}, provincia de {{ ubicacion.provincia }}{% if not loop.last %}; y, {% endif %}{% endfor %}{% else %}el inmueble antes descrito{% endif %}, dentro de sus linderos generales y específicos y cuyos demás antecedentes de dominio constan claramente detallados en la cláusula de antecedentes.</w:t>
+      </w:r>
+    </w:p>
+    <w:p>
+      <w:r>
+        <w:t xml:space="preserve"/>
+      </w:r>
+    </w:p>
+    <w:p>
+      <w:pPr>
+        <w:jc w:val="both"/>
+      </w:pPr>
+      <w:r>
+        <w:t xml:space="preserve">{% if precio_manual %}{{ precio_texto|richtext }}{% else %}CUARTA.- PRECIO Y FORMA DE PAGO.- El precio de venta que de común acuerdo han establecido las partes por el inmueble antes descrito, es la suma de {{ precio.total_palabras }}. El precio acordado es fijo, pactado exclusivamente en dólares de los Estados Unidos de América, por lo tanto no se podrá hacer su pago en ningún otro tipo de moneda; contiene el inmueble en su totalidad como cuerpo cierto y singularizado y no podrá ser objeto de reajustes por motivo alguno, mismo que es pagado por la parte COMPRADORA de la siguiente forma: {% for parte in precio.partes %}{{ parte.letra }}).- {% if loop.last and precio.partes|length &gt; 1 %}El saldo restante de{% else %}La suma de{% endif %} {{ parte.monto_palabras }}{% if parte.es_cuotas %}, pagaderos en {{ parte.numero_cuotas_palabras }} cuotas {{ parte.periodicidad }}s de {{ parte.valor_cuota_palabras }} cada una{% endif %}{% if parte.momento_pago == 'ya_pagado' %}, se cancelaron utilizando el sistema financiero ecuatoriano con anterioridad a la celebración de este contrato mediante {{ parte.medio_pago }}{% if parte.detalle_transferencia %}, {{ parte.detalle_transferencia }}{% endif %}, cuyos comprobantes se habilitan en copias certificadas, valor que es aceptado por la parte VENDEDORA a su entera satisfacción{% elif parte.momento_pago == 'al_firmar' %}, son pagados mediante {{ parte.medio_pago }}{% if parte.detalle_transferencia %}, {{ parte.detalle_transferencia }}{% endif %} en forma concomitante con la firma de las escrituras de compraventa definitivas, cuyos habilitantes en copia certificada se adjuntan, valor que es aceptado por la parte VENDEDORA a su entera satisfacción{% elif parte.momento_pago == 'despues_inscribir' %}, serán pagados mediante {{ parte.medio_pago }}{% if parte.detalle_transferencia %}, {{ parte.detalle_transferencia }}{% endif %} inmediatamente después de que se inscriba el presente título en el Registro de la Propiedad, valor que es aceptado por la parte VENDEDORA a su entera satisfacción{% elif parte.momento_pago == 'otro' %}, serán pagados mediante {{ parte.medio_pago }}{% if parte.detalle_transferencia %}, {{ parte.detalle_transferencia }}{% endif %} el {{ parte.momento_pago_otro }}, valor que es aceptado por la parte VENDEDORA a su entera satisfacción{% endif %}{% if parte.es_credito %}, con fondos provenientes del crédito hipotecario otorgado por {{ parte.entidad_credito }}{% endif %}; y por tal motivo no tendrán nada que reclamar en el futuro por este concepto{% if not loop.last %}; y, {% else %}.{% endif %}{% endfor %}{% endif %}</w:t>
       </w:r>
     </w:p>
     <w:p>

</xml_diff>

<commit_message>
fix: títulos con tilde, redacción de sucesión y espacio en superficie
</commit_message>
<xml_diff>
--- a/backend/app/templates/minuta_compraventa.docx
+++ b/backend/app/templates/minuta_compraventa.docx
@@ -630,7 +630,7 @@
           <w:sz w:val="26"/>
           <w:szCs w:val="26"/>
         </w:rPr>
-        <w:t xml:space="preserve">, {% if parte.tiene_porcentaje %}en el {{ parte.porcentaje_palabras }} de las alícuotas, {% endif %}{% if parte.titulo == 'sucesion' %}{{ parte.nombre_causante }}, adquirió por {{ parte.tipo_sucesion }}, {% else %}adquirió mediante {{ parte.titulo_otro if parte.titulo == 'otro' else parte.titulo }}, {% endif %}a </w:t>
+        <w:t xml:space="preserve">, {% if parte.tiene_porcentaje %}en el {{ parte.porcentaje_palabras }} de las alícuotas, {% endif %}{% if parte.titulo == 'sucesion' %}adquirió por {{ parte.tipo_sucesion_texto }} de {{ parte.nombre_causante }}{% else %}adquirió mediante {{ parte.titulo_texto }}, a </w:t>
       </w:r>
       <w:r>
         <w:rPr>
@@ -646,7 +646,7 @@
           <w:sz w:val="26"/>
           <w:szCs w:val="26"/>
         </w:rPr>
-        <w:t xml:space="preserve">, según escritura pública otorgada el {{ parte.fecha_otorgamiento }}, ante </w:t>
+        <w:t xml:space="preserve">{% endif %}, según escritura pública otorgada el {{ parte.fecha_otorgamiento }}, ante </w:t>
       </w:r>
       <w:r>
         <w:rPr>
@@ -662,7 +662,7 @@
           <w:sz w:val="26"/>
           <w:szCs w:val="26"/>
         </w:rPr>
-        <w:t xml:space="preserve">, {% if parte.mismo_canton %}e inscrita en el Registro de la Propiedad el {{ parte.fecha_inscripcion }}, del mismo cantón.{% else %}e inscrita en el Registro de la Propiedad el {{ parte.fecha_inscripcion }}, del cantón {{ parte.canton_inscripcion }}.{% endif %}{% if parte.es_sucesion %} Por su parte, el causante adquirió la propiedad por {{ parte.causante_titulo_otro if parte.causante_titulo == 'otro' else parte.causante_titulo }}, a {{ parte.causante_adquirido_de }}, según escritura pública otorgada el {{ parte.causante_fecha_otorgamiento }}, ante {{ parte.causante_notario_referencia }}, {% if parte.causante_mismo_canton %}e inscrita en el Registro de la Propiedad el {{ parte.causante_fecha_inscripcion }}, del mismo cantón.{% else %}e inscrita en el Registro de la Propiedad el {{ parte.causante_fecha_inscripcion }}, del cantón {{ parte.causante_canton_inscripcion }}.{% endif %}{% endif %} {% if parte.aclaratorias %}{% for acl in parte.aclaratorias %}Que mediante escritura pública de aclaración{% if acl.titulo %} y {{ acl.titulo_otro if acl.titulo == 'otro' else acl.titulo }}{% endif %} otorgada el {{ acl.fecha_otorgamiento }}, ante la Notaría {% if acl.es_suplente %}Suplente {% endif %}{{ acl.numero_notaria_palabras }} del cantón {{ acl.canton_notaria }}, </w:t>
+        <w:t xml:space="preserve">, {% if parte.mismo_canton %}e inscrita en el Registro de la Propiedad el {{ parte.fecha_inscripcion }}, del mismo cantón.{% else %}e inscrita en el Registro de la Propiedad el {{ parte.fecha_inscripcion }}, del cantón {{ parte.canton_inscripcion }}.{% endif %}{% if parte.es_sucesion %} Por su parte, el causante adquirió la propiedad por {{ parte.causante_titulo_texto }}, a {{ parte.causante_adquirido_de }}, según escritura pública otorgada el {{ parte.causante_fecha_otorgamiento }}, ante {{ parte.causante_notario_referencia }}, {% if parte.causante_mismo_canton %}e inscrita en el Registro de la Propiedad el {{ parte.causante_fecha_inscripcion }}, del mismo cantón.{% else %}e inscrita en el Registro de la Propiedad el {{ parte.causante_fecha_inscripcion }}, del cantón {{ parte.causante_canton_inscripcion }}.{% endif %}{% endif %} {% if parte.aclaratorias %}{% for acl in parte.aclaratorias %}Que mediante escritura pública de aclaración{% if acl.titulo %} y {{ acl.titulo_texto }}{% endif %} otorgada el {{ acl.fecha_otorgamiento }}, ante la Notaría {% if acl.es_suplente %}Suplente {% endif %}{{ acl.numero_notaria_palabras }} del cantón {{ acl.canton_notaria }}, </w:t>
       </w:r>
       <w:r>
         <w:rPr>
@@ -687,7 +687,7 @@
           <w:sz w:val="26"/>
           <w:szCs w:val="26"/>
         </w:rPr>
-        <w:t xml:space="preserve"> {% if acl.mismo_canton %}e inscrita en el Registro de la Propiedad el {{ acl.fecha_inscripcion }}, del mismo cantón{% else %}e inscrita en el Registro de la Propiedad el {{ acl.fecha_inscripcion }}, del cantón {{ acl.canton_inscripcion }}{% endif %}, se aclaró y modificó la escritura antes referida{% if acl.descripcion %}, de la siguiente manera: {{ acl.descripcion }}{% endif %}. {% if acl.aclaratorias %}{% for acl2 in acl.aclaratorias %}Que mediante escritura pública de aclaración{% if acl2.titulo %} y {{ acl2.titulo_otro if acl2.titulo == 'otro' else acl2.titulo }}{% endif %} otorgada el {{ acl2.fecha_otorgamiento }}, ante la Notaría {% if acl2.es_suplente %}Suplente {% endif %}{{ acl2.numero_notaria_palabras }} del cantón {{ acl2.canton_notaria }}, {{ acl2.notario }}, {% if acl2.mismo_canton %}e inscrita en el Registro de la Propiedad el {{ acl2.fecha_inscripcion }}, del mismo cantón{% else %}e inscrita en el Registro de la Propiedad el {{ acl2.fecha_inscripcion }}, del cantón {{ acl2.canton_inscripcion }}{% endif %}, se aclaró y modificó la escritura antes referida{% if acl2.descripcion %}, de la siguiente manera: {{ acl2.descripcion }}{% endif %}. {% endfor %}{% endif %}{% endfor %}{% endif %}{% endfor %}{% endif %}</w:t>
+        <w:t xml:space="preserve"> {% if acl.mismo_canton %}e inscrita en el Registro de la Propiedad el {{ acl.fecha_inscripcion }}, del mismo cantón{% else %}e inscrita en el Registro de la Propiedad el {{ acl.fecha_inscripcion }}, del cantón {{ acl.canton_inscripcion }}{% endif %}, se aclaró y modificó la escritura antes referida{% if acl.descripcion %}, de la siguiente manera: {{ acl.descripcion }}{% endif %}. {% if acl.aclaratorias %}{% for acl2 in acl.aclaratorias %}Que mediante escritura pública de aclaración{% if acl2.titulo %} y {{ acl2.titulo_texto }}{% endif %} otorgada el {{ acl2.fecha_otorgamiento }}, ante la Notaría {% if acl2.es_suplente %}Suplente {% endif %}{{ acl2.numero_notaria_palabras }} del cantón {{ acl2.canton_notaria }}, {{ acl2.notario }}, {% if acl2.mismo_canton %}e inscrita en el Registro de la Propiedad el {{ acl2.fecha_inscripcion }}, del mismo cantón{% else %}e inscrita en el Registro de la Propiedad el {{ acl2.fecha_inscripcion }}, del cantón {{ acl2.canton_inscripcion }}{% endif %}, se aclaró y modificó la escritura antes referida{% if acl2.descripcion %}, de la siguiente manera: {{ acl2.descripcion }}{% endif %}. {% endfor %}{% endif %}{% endfor %}{% endif %}{% endfor %}{% endif %}</w:t>
       </w:r>
     </w:p>
     <w:p>
@@ -849,14 +849,14 @@
           <w:sz w:val="26"/>
           <w:szCs w:val="26"/>
         </w:rPr>
-        <w:t>SUPERFICIE:</w:t>
-      </w:r>
-      <w:r>
-        <w:rPr>
-          <w:sz w:val="26"/>
-          <w:szCs w:val="26"/>
-        </w:rPr>
-        <w:t>{{ linderos.superficie_palabras }} {% if tiene_linderos_especificos %}; mientras que, los linderos específicos constan en la declaratoria de Propiedad Horizontal referida y en la escritura de compraventa que constituye el título de dominio que posee la parte VENDEDORA y cuya parte pertinente se agrega a la presente escritura como habilitante{% endif %}.</w:t>
+        <w:t xml:space="preserve">SUPERFICIE: </w:t>
+      </w:r>
+      <w:r>
+        <w:rPr>
+          <w:sz w:val="26"/>
+          <w:szCs w:val="26"/>
+        </w:rPr>
+        <w:t>{{ linderos.superficie_palabras }}{% if tiene_linderos_especificos %}; mientras que, los linderos específicos constan en la declaratoria de Propiedad Horizontal referida y en la escritura de compraventa que constituye el título de dominio que posee la parte VENDEDORA y cuya parte pertinente se agrega a la presente escritura como habilitante{% endif %}.</w:t>
       </w:r>
     </w:p>
     <w:p>

</xml_diff>